<commit_message>
docs: thêm ảnh chụp màn hình + ghi chú vào Hướng dẫn sử dụng AIQMS
- 32 ảnh chụp màn hình thật (Playwright) cho mọi bước/màn hình chính
- gen-userguide.ts nhúng ảnh + ghi chú dưới từng ảnh; tài liệu .docx ~2.8MB
- scripts/seed-demo-content.ts (seed nội dung demo), scripts/screenshots.mjs (chụp ảnh)

https://claude.ai/code/session_01Ra1ofbTJ9X2a54i9dhGJH6
</commit_message>
<xml_diff>
--- a/docs/Huong_dan_su_dung_AIQMS.docx
+++ b/docs/Huong_dan_su_dung_AIQMS.docx
@@ -365,6 +365,68 @@
           <w:iCs/>
         </w:rPr>
         <w:t xml:space="preserve">Mỗi tài khoản thuộc một trường (tenant). Dữ liệu giữa các trường được cách ly hoàn toàn. Đổi mật khẩu mặc định ngay sau lần đăng nhập đầu tiên.</w:t>
+      </w:r>
+    </w:p>
+    <w:p>
+      <w:pPr>
+        <w:spacing w:after="20" w:before="100"/>
+        <w:jc w:val="center"/>
+      </w:pPr>
+      <w:r>
+        <w:drawing>
+          <wp:inline distT="0" distB="0" distL="0" distR="0">
+            <wp:extent cx="5715000" cy="3571875"/>
+            <wp:effectExtent t="0" r="0" b="0" l="0"/>
+            <wp:docPr id="1" name="" descr="" title=""/>
+            <wp:cNvGraphicFramePr>
+              <a:graphicFrameLocks xmlns:a="http://schemas.openxmlformats.org/drawingml/2006/main" noChangeAspect="1"/>
+            </wp:cNvGraphicFramePr>
+            <a:graphic xmlns:a="http://schemas.openxmlformats.org/drawingml/2006/main">
+              <a:graphicData uri="http://schemas.openxmlformats.org/drawingml/2006/picture">
+                <pic:pic xmlns:pic="http://schemas.openxmlformats.org/drawingml/2006/picture">
+                  <pic:nvPicPr>
+                    <pic:cNvPr id="0" name="" descr=""/>
+                    <pic:cNvPicPr>
+                      <a:picLocks noChangeAspect="1" noChangeArrowheads="1"/>
+                    </pic:cNvPicPr>
+                  </pic:nvPicPr>
+                  <pic:blipFill>
+                    <a:blip r:embed="rId7" cstate="none"/>
+                    <a:srcRect/>
+                    <a:stretch>
+                      <a:fillRect/>
+                    </a:stretch>
+                  </pic:blipFill>
+                  <pic:spPr bwMode="auto">
+                    <a:xfrm>
+                      <a:off x="0" y="0"/>
+                      <a:ext cx="5715000" cy="3571875"/>
+                    </a:xfrm>
+                    <a:prstGeom prst="rect">
+                      <a:avLst/>
+                    </a:prstGeom>
+                  </pic:spPr>
+                </pic:pic>
+              </a:graphicData>
+            </a:graphic>
+          </wp:inline>
+        </w:drawing>
+      </w:r>
+    </w:p>
+    <w:p>
+      <w:pPr>
+        <w:spacing w:after="140"/>
+        <w:jc w:val="center"/>
+      </w:pPr>
+      <w:r>
+        <w:rPr>
+          <w:i/>
+          <w:iCs/>
+          <w:color w:val="555555"/>
+          <w:sz w:val="18"/>
+          <w:szCs w:val="18"/>
+        </w:rPr>
+        <w:t xml:space="preserve">▲ Màn hình đăng nhập: nhập Mã trường (tenant), Email, Mật khẩu rồi bấm Đăng nhập.</w:t>
       </w:r>
     </w:p>
     <w:p>
@@ -2165,6 +2227,68 @@
     </w:p>
     <w:p>
       <w:pPr>
+        <w:spacing w:after="20" w:before="100"/>
+        <w:jc w:val="center"/>
+      </w:pPr>
+      <w:r>
+        <w:drawing>
+          <wp:inline distT="0" distB="0" distL="0" distR="0">
+            <wp:extent cx="5715000" cy="3571875"/>
+            <wp:effectExtent t="0" r="0" b="0" l="0"/>
+            <wp:docPr id="1" name="" descr="" title=""/>
+            <wp:cNvGraphicFramePr>
+              <a:graphicFrameLocks xmlns:a="http://schemas.openxmlformats.org/drawingml/2006/main" noChangeAspect="1"/>
+            </wp:cNvGraphicFramePr>
+            <a:graphic xmlns:a="http://schemas.openxmlformats.org/drawingml/2006/main">
+              <a:graphicData uri="http://schemas.openxmlformats.org/drawingml/2006/picture">
+                <pic:pic xmlns:pic="http://schemas.openxmlformats.org/drawingml/2006/picture">
+                  <pic:nvPicPr>
+                    <pic:cNvPr id="0" name="" descr=""/>
+                    <pic:cNvPicPr>
+                      <a:picLocks noChangeAspect="1" noChangeArrowheads="1"/>
+                    </pic:cNvPicPr>
+                  </pic:nvPicPr>
+                  <pic:blipFill>
+                    <a:blip r:embed="rId8" cstate="none"/>
+                    <a:srcRect/>
+                    <a:stretch>
+                      <a:fillRect/>
+                    </a:stretch>
+                  </pic:blipFill>
+                  <pic:spPr bwMode="auto">
+                    <a:xfrm>
+                      <a:off x="0" y="0"/>
+                      <a:ext cx="5715000" cy="3571875"/>
+                    </a:xfrm>
+                    <a:prstGeom prst="rect">
+                      <a:avLst/>
+                    </a:prstGeom>
+                  </pic:spPr>
+                </pic:pic>
+              </a:graphicData>
+            </a:graphic>
+          </wp:inline>
+        </w:drawing>
+      </w:r>
+    </w:p>
+    <w:p>
+      <w:pPr>
+        <w:spacing w:after="140"/>
+        <w:jc w:val="center"/>
+      </w:pPr>
+      <w:r>
+        <w:rPr>
+          <w:i/>
+          <w:iCs/>
+          <w:color w:val="555555"/>
+          <w:sz w:val="18"/>
+          <w:szCs w:val="18"/>
+        </w:rPr>
+        <w:t xml:space="preserve">▲ Dashboard: số liệu tổng quan toàn trường và mục “Việc của tôi”.</w:t>
+      </w:r>
+    </w:p>
+    <w:p>
+      <w:pPr>
         <w:pStyle w:val="Heading2"/>
         <w:spacing w:after="80" w:before="200"/>
       </w:pPr>
@@ -2250,6 +2374,192 @@
     </w:p>
     <w:p>
       <w:pPr>
+        <w:spacing w:after="20" w:before="100"/>
+        <w:jc w:val="center"/>
+      </w:pPr>
+      <w:r>
+        <w:drawing>
+          <wp:inline distT="0" distB="0" distL="0" distR="0">
+            <wp:extent cx="5715000" cy="3571875"/>
+            <wp:effectExtent t="0" r="0" b="0" l="0"/>
+            <wp:docPr id="1" name="" descr="" title=""/>
+            <wp:cNvGraphicFramePr>
+              <a:graphicFrameLocks xmlns:a="http://schemas.openxmlformats.org/drawingml/2006/main" noChangeAspect="1"/>
+            </wp:cNvGraphicFramePr>
+            <a:graphic xmlns:a="http://schemas.openxmlformats.org/drawingml/2006/main">
+              <a:graphicData uri="http://schemas.openxmlformats.org/drawingml/2006/picture">
+                <pic:pic xmlns:pic="http://schemas.openxmlformats.org/drawingml/2006/picture">
+                  <pic:nvPicPr>
+                    <pic:cNvPr id="0" name="" descr=""/>
+                    <pic:cNvPicPr>
+                      <a:picLocks noChangeAspect="1" noChangeArrowheads="1"/>
+                    </pic:cNvPicPr>
+                  </pic:nvPicPr>
+                  <pic:blipFill>
+                    <a:blip r:embed="rId9" cstate="none"/>
+                    <a:srcRect/>
+                    <a:stretch>
+                      <a:fillRect/>
+                    </a:stretch>
+                  </pic:blipFill>
+                  <pic:spPr bwMode="auto">
+                    <a:xfrm>
+                      <a:off x="0" y="0"/>
+                      <a:ext cx="5715000" cy="3571875"/>
+                    </a:xfrm>
+                    <a:prstGeom prst="rect">
+                      <a:avLst/>
+                    </a:prstGeom>
+                  </pic:spPr>
+                </pic:pic>
+              </a:graphicData>
+            </a:graphic>
+          </wp:inline>
+        </w:drawing>
+      </w:r>
+    </w:p>
+    <w:p>
+      <w:pPr>
+        <w:spacing w:after="140"/>
+        <w:jc w:val="center"/>
+      </w:pPr>
+      <w:r>
+        <w:rPr>
+          <w:i/>
+          <w:iCs/>
+          <w:color w:val="555555"/>
+          <w:sz w:val="18"/>
+          <w:szCs w:val="18"/>
+        </w:rPr>
+        <w:t xml:space="preserve">▲ Danh sách CTĐT — bấm “+ Tạo CTĐT” để thêm, bấm tên để mở chi tiết.</w:t>
+      </w:r>
+    </w:p>
+    <w:p>
+      <w:pPr>
+        <w:spacing w:after="20" w:before="100"/>
+        <w:jc w:val="center"/>
+      </w:pPr>
+      <w:r>
+        <w:drawing>
+          <wp:inline distT="0" distB="0" distL="0" distR="0">
+            <wp:extent cx="5715000" cy="3571875"/>
+            <wp:effectExtent t="0" r="0" b="0" l="0"/>
+            <wp:docPr id="1" name="" descr="" title=""/>
+            <wp:cNvGraphicFramePr>
+              <a:graphicFrameLocks xmlns:a="http://schemas.openxmlformats.org/drawingml/2006/main" noChangeAspect="1"/>
+            </wp:cNvGraphicFramePr>
+            <a:graphic xmlns:a="http://schemas.openxmlformats.org/drawingml/2006/main">
+              <a:graphicData uri="http://schemas.openxmlformats.org/drawingml/2006/picture">
+                <pic:pic xmlns:pic="http://schemas.openxmlformats.org/drawingml/2006/picture">
+                  <pic:nvPicPr>
+                    <pic:cNvPr id="0" name="" descr=""/>
+                    <pic:cNvPicPr>
+                      <a:picLocks noChangeAspect="1" noChangeArrowheads="1"/>
+                    </pic:cNvPicPr>
+                  </pic:nvPicPr>
+                  <pic:blipFill>
+                    <a:blip r:embed="rId10" cstate="none"/>
+                    <a:srcRect/>
+                    <a:stretch>
+                      <a:fillRect/>
+                    </a:stretch>
+                  </pic:blipFill>
+                  <pic:spPr bwMode="auto">
+                    <a:xfrm>
+                      <a:off x="0" y="0"/>
+                      <a:ext cx="5715000" cy="3571875"/>
+                    </a:xfrm>
+                    <a:prstGeom prst="rect">
+                      <a:avLst/>
+                    </a:prstGeom>
+                  </pic:spPr>
+                </pic:pic>
+              </a:graphicData>
+            </a:graphic>
+          </wp:inline>
+        </w:drawing>
+      </w:r>
+    </w:p>
+    <w:p>
+      <w:pPr>
+        <w:spacing w:after="140"/>
+        <w:jc w:val="center"/>
+      </w:pPr>
+      <w:r>
+        <w:rPr>
+          <w:i/>
+          <w:iCs/>
+          <w:color w:val="555555"/>
+          <w:sz w:val="18"/>
+          <w:szCs w:val="18"/>
+        </w:rPr>
+        <w:t xml:space="preserve">▲ Hộp thoại tạo CTĐT: nhập mã ngành, tên, trình độ.</w:t>
+      </w:r>
+    </w:p>
+    <w:p>
+      <w:pPr>
+        <w:spacing w:after="20" w:before="100"/>
+        <w:jc w:val="center"/>
+      </w:pPr>
+      <w:r>
+        <w:drawing>
+          <wp:inline distT="0" distB="0" distL="0" distR="0">
+            <wp:extent cx="5715000" cy="3571875"/>
+            <wp:effectExtent t="0" r="0" b="0" l="0"/>
+            <wp:docPr id="1" name="" descr="" title=""/>
+            <wp:cNvGraphicFramePr>
+              <a:graphicFrameLocks xmlns:a="http://schemas.openxmlformats.org/drawingml/2006/main" noChangeAspect="1"/>
+            </wp:cNvGraphicFramePr>
+            <a:graphic xmlns:a="http://schemas.openxmlformats.org/drawingml/2006/main">
+              <a:graphicData uri="http://schemas.openxmlformats.org/drawingml/2006/picture">
+                <pic:pic xmlns:pic="http://schemas.openxmlformats.org/drawingml/2006/picture">
+                  <pic:nvPicPr>
+                    <pic:cNvPr id="0" name="" descr=""/>
+                    <pic:cNvPicPr>
+                      <a:picLocks noChangeAspect="1" noChangeArrowheads="1"/>
+                    </pic:cNvPicPr>
+                  </pic:nvPicPr>
+                  <pic:blipFill>
+                    <a:blip r:embed="rId11" cstate="none"/>
+                    <a:srcRect/>
+                    <a:stretch>
+                      <a:fillRect/>
+                    </a:stretch>
+                  </pic:blipFill>
+                  <pic:spPr bwMode="auto">
+                    <a:xfrm>
+                      <a:off x="0" y="0"/>
+                      <a:ext cx="5715000" cy="3571875"/>
+                    </a:xfrm>
+                    <a:prstGeom prst="rect">
+                      <a:avLst/>
+                    </a:prstGeom>
+                  </pic:spPr>
+                </pic:pic>
+              </a:graphicData>
+            </a:graphic>
+          </wp:inline>
+        </w:drawing>
+      </w:r>
+    </w:p>
+    <w:p>
+      <w:pPr>
+        <w:spacing w:after="140"/>
+        <w:jc w:val="center"/>
+      </w:pPr>
+      <w:r>
+        <w:rPr>
+          <w:i/>
+          <w:iCs/>
+          <w:color w:val="555555"/>
+          <w:sz w:val="18"/>
+          <w:szCs w:val="18"/>
+        </w:rPr>
+        <w:t xml:space="preserve">▲ Chi tiết CTĐT: chọn phiên bản, đổi trạng thái, quản lý PEO/PLO.</w:t>
+      </w:r>
+    </w:p>
+    <w:p>
+      <w:pPr>
         <w:pStyle w:val="Heading2"/>
         <w:spacing w:after="80" w:before="200"/>
       </w:pPr>
@@ -2328,6 +2638,68 @@
     </w:p>
     <w:p>
       <w:pPr>
+        <w:spacing w:after="20" w:before="100"/>
+        <w:jc w:val="center"/>
+      </w:pPr>
+      <w:r>
+        <w:drawing>
+          <wp:inline distT="0" distB="0" distL="0" distR="0">
+            <wp:extent cx="5715000" cy="3571875"/>
+            <wp:effectExtent t="0" r="0" b="0" l="0"/>
+            <wp:docPr id="1" name="" descr="" title=""/>
+            <wp:cNvGraphicFramePr>
+              <a:graphicFrameLocks xmlns:a="http://schemas.openxmlformats.org/drawingml/2006/main" noChangeAspect="1"/>
+            </wp:cNvGraphicFramePr>
+            <a:graphic xmlns:a="http://schemas.openxmlformats.org/drawingml/2006/main">
+              <a:graphicData uri="http://schemas.openxmlformats.org/drawingml/2006/picture">
+                <pic:pic xmlns:pic="http://schemas.openxmlformats.org/drawingml/2006/picture">
+                  <pic:nvPicPr>
+                    <pic:cNvPr id="0" name="" descr=""/>
+                    <pic:cNvPicPr>
+                      <a:picLocks noChangeAspect="1" noChangeArrowheads="1"/>
+                    </pic:cNvPicPr>
+                  </pic:nvPicPr>
+                  <pic:blipFill>
+                    <a:blip r:embed="rId12" cstate="none"/>
+                    <a:srcRect/>
+                    <a:stretch>
+                      <a:fillRect/>
+                    </a:stretch>
+                  </pic:blipFill>
+                  <pic:spPr bwMode="auto">
+                    <a:xfrm>
+                      <a:off x="0" y="0"/>
+                      <a:ext cx="5715000" cy="3571875"/>
+                    </a:xfrm>
+                    <a:prstGeom prst="rect">
+                      <a:avLst/>
+                    </a:prstGeom>
+                  </pic:spPr>
+                </pic:pic>
+              </a:graphicData>
+            </a:graphic>
+          </wp:inline>
+        </w:drawing>
+      </w:r>
+    </w:p>
+    <w:p>
+      <w:pPr>
+        <w:spacing w:after="140"/>
+        <w:jc w:val="center"/>
+      </w:pPr>
+      <w:r>
+        <w:rPr>
+          <w:i/>
+          <w:iCs/>
+          <w:color w:val="555555"/>
+          <w:sz w:val="18"/>
+          <w:szCs w:val="18"/>
+        </w:rPr>
+        <w:t xml:space="preserve">▲ Ma trận PLO×học phần (bấm ô đặt mức I/R/M), CLO↔PLO và cảnh báo độ phủ.</w:t>
+      </w:r>
+    </w:p>
+    <w:p>
+      <w:pPr>
         <w:pStyle w:val="Heading2"/>
         <w:spacing w:after="80" w:before="200"/>
       </w:pPr>
@@ -2380,6 +2752,130 @@
     </w:p>
     <w:p>
       <w:pPr>
+        <w:spacing w:after="20" w:before="100"/>
+        <w:jc w:val="center"/>
+      </w:pPr>
+      <w:r>
+        <w:drawing>
+          <wp:inline distT="0" distB="0" distL="0" distR="0">
+            <wp:extent cx="5715000" cy="3571875"/>
+            <wp:effectExtent t="0" r="0" b="0" l="0"/>
+            <wp:docPr id="1" name="" descr="" title=""/>
+            <wp:cNvGraphicFramePr>
+              <a:graphicFrameLocks xmlns:a="http://schemas.openxmlformats.org/drawingml/2006/main" noChangeAspect="1"/>
+            </wp:cNvGraphicFramePr>
+            <a:graphic xmlns:a="http://schemas.openxmlformats.org/drawingml/2006/main">
+              <a:graphicData uri="http://schemas.openxmlformats.org/drawingml/2006/picture">
+                <pic:pic xmlns:pic="http://schemas.openxmlformats.org/drawingml/2006/picture">
+                  <pic:nvPicPr>
+                    <pic:cNvPr id="0" name="" descr=""/>
+                    <pic:cNvPicPr>
+                      <a:picLocks noChangeAspect="1" noChangeArrowheads="1"/>
+                    </pic:cNvPicPr>
+                  </pic:nvPicPr>
+                  <pic:blipFill>
+                    <a:blip r:embed="rId13" cstate="none"/>
+                    <a:srcRect/>
+                    <a:stretch>
+                      <a:fillRect/>
+                    </a:stretch>
+                  </pic:blipFill>
+                  <pic:spPr bwMode="auto">
+                    <a:xfrm>
+                      <a:off x="0" y="0"/>
+                      <a:ext cx="5715000" cy="3571875"/>
+                    </a:xfrm>
+                    <a:prstGeom prst="rect">
+                      <a:avLst/>
+                    </a:prstGeom>
+                  </pic:spPr>
+                </pic:pic>
+              </a:graphicData>
+            </a:graphic>
+          </wp:inline>
+        </w:drawing>
+      </w:r>
+    </w:p>
+    <w:p>
+      <w:pPr>
+        <w:spacing w:after="140"/>
+        <w:jc w:val="center"/>
+      </w:pPr>
+      <w:r>
+        <w:rPr>
+          <w:i/>
+          <w:iCs/>
+          <w:color w:val="555555"/>
+          <w:sz w:val="18"/>
+          <w:szCs w:val="18"/>
+        </w:rPr>
+        <w:t xml:space="preserve">▲ Danh sách học phần — bấm tên để mở đề cương.</w:t>
+      </w:r>
+    </w:p>
+    <w:p>
+      <w:pPr>
+        <w:spacing w:after="20" w:before="100"/>
+        <w:jc w:val="center"/>
+      </w:pPr>
+      <w:r>
+        <w:drawing>
+          <wp:inline distT="0" distB="0" distL="0" distR="0">
+            <wp:extent cx="5715000" cy="3571875"/>
+            <wp:effectExtent t="0" r="0" b="0" l="0"/>
+            <wp:docPr id="1" name="" descr="" title=""/>
+            <wp:cNvGraphicFramePr>
+              <a:graphicFrameLocks xmlns:a="http://schemas.openxmlformats.org/drawingml/2006/main" noChangeAspect="1"/>
+            </wp:cNvGraphicFramePr>
+            <a:graphic xmlns:a="http://schemas.openxmlformats.org/drawingml/2006/main">
+              <a:graphicData uri="http://schemas.openxmlformats.org/drawingml/2006/picture">
+                <pic:pic xmlns:pic="http://schemas.openxmlformats.org/drawingml/2006/picture">
+                  <pic:nvPicPr>
+                    <pic:cNvPr id="0" name="" descr=""/>
+                    <pic:cNvPicPr>
+                      <a:picLocks noChangeAspect="1" noChangeArrowheads="1"/>
+                    </pic:cNvPicPr>
+                  </pic:nvPicPr>
+                  <pic:blipFill>
+                    <a:blip r:embed="rId14" cstate="none"/>
+                    <a:srcRect/>
+                    <a:stretch>
+                      <a:fillRect/>
+                    </a:stretch>
+                  </pic:blipFill>
+                  <pic:spPr bwMode="auto">
+                    <a:xfrm>
+                      <a:off x="0" y="0"/>
+                      <a:ext cx="5715000" cy="3571875"/>
+                    </a:xfrm>
+                    <a:prstGeom prst="rect">
+                      <a:avLst/>
+                    </a:prstGeom>
+                  </pic:spPr>
+                </pic:pic>
+              </a:graphicData>
+            </a:graphic>
+          </wp:inline>
+        </w:drawing>
+      </w:r>
+    </w:p>
+    <w:p>
+      <w:pPr>
+        <w:spacing w:after="140"/>
+        <w:jc w:val="center"/>
+      </w:pPr>
+      <w:r>
+        <w:rPr>
+          <w:i/>
+          <w:iCs/>
+          <w:color w:val="555555"/>
+          <w:sz w:val="18"/>
+          <w:szCs w:val="18"/>
+        </w:rPr>
+        <w:t xml:space="preserve">▲ Chi tiết đề cương học phần và quản lý CLO ở panel bên phải.</w:t>
+      </w:r>
+    </w:p>
+    <w:p>
+      <w:pPr>
         <w:pStyle w:val="Heading2"/>
         <w:spacing w:after="80" w:before="200"/>
       </w:pPr>
@@ -2401,6 +2897,68 @@
     </w:p>
     <w:p>
       <w:pPr>
+        <w:spacing w:after="20" w:before="100"/>
+        <w:jc w:val="center"/>
+      </w:pPr>
+      <w:r>
+        <w:drawing>
+          <wp:inline distT="0" distB="0" distL="0" distR="0">
+            <wp:extent cx="5715000" cy="3571875"/>
+            <wp:effectExtent t="0" r="0" b="0" l="0"/>
+            <wp:docPr id="1" name="" descr="" title=""/>
+            <wp:cNvGraphicFramePr>
+              <a:graphicFrameLocks xmlns:a="http://schemas.openxmlformats.org/drawingml/2006/main" noChangeAspect="1"/>
+            </wp:cNvGraphicFramePr>
+            <a:graphic xmlns:a="http://schemas.openxmlformats.org/drawingml/2006/main">
+              <a:graphicData uri="http://schemas.openxmlformats.org/drawingml/2006/picture">
+                <pic:pic xmlns:pic="http://schemas.openxmlformats.org/drawingml/2006/picture">
+                  <pic:nvPicPr>
+                    <pic:cNvPr id="0" name="" descr=""/>
+                    <pic:cNvPicPr>
+                      <a:picLocks noChangeAspect="1" noChangeArrowheads="1"/>
+                    </pic:cNvPicPr>
+                  </pic:nvPicPr>
+                  <pic:blipFill>
+                    <a:blip r:embed="rId15" cstate="none"/>
+                    <a:srcRect/>
+                    <a:stretch>
+                      <a:fillRect/>
+                    </a:stretch>
+                  </pic:blipFill>
+                  <pic:spPr bwMode="auto">
+                    <a:xfrm>
+                      <a:off x="0" y="0"/>
+                      <a:ext cx="5715000" cy="3571875"/>
+                    </a:xfrm>
+                    <a:prstGeom prst="rect">
+                      <a:avLst/>
+                    </a:prstGeom>
+                  </pic:spPr>
+                </pic:pic>
+              </a:graphicData>
+            </a:graphic>
+          </wp:inline>
+        </w:drawing>
+      </w:r>
+    </w:p>
+    <w:p>
+      <w:pPr>
+        <w:spacing w:after="140"/>
+        <w:jc w:val="center"/>
+      </w:pPr>
+      <w:r>
+        <w:rPr>
+          <w:i/>
+          <w:iCs/>
+          <w:color w:val="555555"/>
+          <w:sz w:val="18"/>
+          <w:szCs w:val="18"/>
+        </w:rPr>
+        <w:t xml:space="preserve">▲ Bộ tiêu chuẩn: chọn AUN-QA/MOET để xem tiêu chí và thang đánh giá 7 mức.</w:t>
+      </w:r>
+    </w:p>
+    <w:p>
+      <w:pPr>
         <w:pStyle w:val="Heading2"/>
         <w:spacing w:after="80" w:before="200"/>
       </w:pPr>
@@ -2449,6 +3007,130 @@
       </w:pPr>
       <w:r>
         <w:t xml:space="preserve">Khi hoàn tất, bấm “Đóng đợt”.</w:t>
+      </w:r>
+    </w:p>
+    <w:p>
+      <w:pPr>
+        <w:spacing w:after="20" w:before="100"/>
+        <w:jc w:val="center"/>
+      </w:pPr>
+      <w:r>
+        <w:drawing>
+          <wp:inline distT="0" distB="0" distL="0" distR="0">
+            <wp:extent cx="5715000" cy="3571875"/>
+            <wp:effectExtent t="0" r="0" b="0" l="0"/>
+            <wp:docPr id="1" name="" descr="" title=""/>
+            <wp:cNvGraphicFramePr>
+              <a:graphicFrameLocks xmlns:a="http://schemas.openxmlformats.org/drawingml/2006/main" noChangeAspect="1"/>
+            </wp:cNvGraphicFramePr>
+            <a:graphic xmlns:a="http://schemas.openxmlformats.org/drawingml/2006/main">
+              <a:graphicData uri="http://schemas.openxmlformats.org/drawingml/2006/picture">
+                <pic:pic xmlns:pic="http://schemas.openxmlformats.org/drawingml/2006/picture">
+                  <pic:nvPicPr>
+                    <pic:cNvPr id="0" name="" descr=""/>
+                    <pic:cNvPicPr>
+                      <a:picLocks noChangeAspect="1" noChangeArrowheads="1"/>
+                    </pic:cNvPicPr>
+                  </pic:nvPicPr>
+                  <pic:blipFill>
+                    <a:blip r:embed="rId16" cstate="none"/>
+                    <a:srcRect/>
+                    <a:stretch>
+                      <a:fillRect/>
+                    </a:stretch>
+                  </pic:blipFill>
+                  <pic:spPr bwMode="auto">
+                    <a:xfrm>
+                      <a:off x="0" y="0"/>
+                      <a:ext cx="5715000" cy="3571875"/>
+                    </a:xfrm>
+                    <a:prstGeom prst="rect">
+                      <a:avLst/>
+                    </a:prstGeom>
+                  </pic:spPr>
+                </pic:pic>
+              </a:graphicData>
+            </a:graphic>
+          </wp:inline>
+        </w:drawing>
+      </w:r>
+    </w:p>
+    <w:p>
+      <w:pPr>
+        <w:spacing w:after="140"/>
+        <w:jc w:val="center"/>
+      </w:pPr>
+      <w:r>
+        <w:rPr>
+          <w:i/>
+          <w:iCs/>
+          <w:color w:val="555555"/>
+          <w:sz w:val="18"/>
+          <w:szCs w:val="18"/>
+        </w:rPr>
+        <w:t xml:space="preserve">▲ Danh sách đợt tự đánh giá kèm số SAR và trạng thái.</w:t>
+      </w:r>
+    </w:p>
+    <w:p>
+      <w:pPr>
+        <w:spacing w:after="20" w:before="100"/>
+        <w:jc w:val="center"/>
+      </w:pPr>
+      <w:r>
+        <w:drawing>
+          <wp:inline distT="0" distB="0" distL="0" distR="0">
+            <wp:extent cx="5715000" cy="3571875"/>
+            <wp:effectExtent t="0" r="0" b="0" l="0"/>
+            <wp:docPr id="1" name="" descr="" title=""/>
+            <wp:cNvGraphicFramePr>
+              <a:graphicFrameLocks xmlns:a="http://schemas.openxmlformats.org/drawingml/2006/main" noChangeAspect="1"/>
+            </wp:cNvGraphicFramePr>
+            <a:graphic xmlns:a="http://schemas.openxmlformats.org/drawingml/2006/main">
+              <a:graphicData uri="http://schemas.openxmlformats.org/drawingml/2006/picture">
+                <pic:pic xmlns:pic="http://schemas.openxmlformats.org/drawingml/2006/picture">
+                  <pic:nvPicPr>
+                    <pic:cNvPr id="0" name="" descr=""/>
+                    <pic:cNvPicPr>
+                      <a:picLocks noChangeAspect="1" noChangeArrowheads="1"/>
+                    </pic:cNvPicPr>
+                  </pic:nvPicPr>
+                  <pic:blipFill>
+                    <a:blip r:embed="rId17" cstate="none"/>
+                    <a:srcRect/>
+                    <a:stretch>
+                      <a:fillRect/>
+                    </a:stretch>
+                  </pic:blipFill>
+                  <pic:spPr bwMode="auto">
+                    <a:xfrm>
+                      <a:off x="0" y="0"/>
+                      <a:ext cx="5715000" cy="3571875"/>
+                    </a:xfrm>
+                    <a:prstGeom prst="rect">
+                      <a:avLst/>
+                    </a:prstGeom>
+                  </pic:spPr>
+                </pic:pic>
+              </a:graphicData>
+            </a:graphic>
+          </wp:inline>
+        </w:drawing>
+      </w:r>
+    </w:p>
+    <w:p>
+      <w:pPr>
+        <w:spacing w:after="140"/>
+        <w:jc w:val="center"/>
+      </w:pPr>
+      <w:r>
+        <w:rPr>
+          <w:i/>
+          <w:iCs/>
+          <w:color w:val="555555"/>
+          <w:sz w:val="18"/>
+          <w:szCs w:val="18"/>
+        </w:rPr>
+        <w:t xml:space="preserve">▲ Chi tiết đợt: đóng/mở đợt và tạo SAR cho từng chương trình.</w:t>
       </w:r>
     </w:p>
     <w:p>
@@ -2717,6 +3399,316 @@
     </w:p>
     <w:p>
       <w:pPr>
+        <w:spacing w:after="20" w:before="100"/>
+        <w:jc w:val="center"/>
+      </w:pPr>
+      <w:r>
+        <w:drawing>
+          <wp:inline distT="0" distB="0" distL="0" distR="0">
+            <wp:extent cx="5715000" cy="3571875"/>
+            <wp:effectExtent t="0" r="0" b="0" l="0"/>
+            <wp:docPr id="1" name="" descr="" title=""/>
+            <wp:cNvGraphicFramePr>
+              <a:graphicFrameLocks xmlns:a="http://schemas.openxmlformats.org/drawingml/2006/main" noChangeAspect="1"/>
+            </wp:cNvGraphicFramePr>
+            <a:graphic xmlns:a="http://schemas.openxmlformats.org/drawingml/2006/main">
+              <a:graphicData uri="http://schemas.openxmlformats.org/drawingml/2006/picture">
+                <pic:pic xmlns:pic="http://schemas.openxmlformats.org/drawingml/2006/picture">
+                  <pic:nvPicPr>
+                    <pic:cNvPr id="0" name="" descr=""/>
+                    <pic:cNvPicPr>
+                      <a:picLocks noChangeAspect="1" noChangeArrowheads="1"/>
+                    </pic:cNvPicPr>
+                  </pic:nvPicPr>
+                  <pic:blipFill>
+                    <a:blip r:embed="rId18" cstate="none"/>
+                    <a:srcRect/>
+                    <a:stretch>
+                      <a:fillRect/>
+                    </a:stretch>
+                  </pic:blipFill>
+                  <pic:spPr bwMode="auto">
+                    <a:xfrm>
+                      <a:off x="0" y="0"/>
+                      <a:ext cx="5715000" cy="3571875"/>
+                    </a:xfrm>
+                    <a:prstGeom prst="rect">
+                      <a:avLst/>
+                    </a:prstGeom>
+                  </pic:spPr>
+                </pic:pic>
+              </a:graphicData>
+            </a:graphic>
+          </wp:inline>
+        </w:drawing>
+      </w:r>
+    </w:p>
+    <w:p>
+      <w:pPr>
+        <w:spacing w:after="140"/>
+        <w:jc w:val="center"/>
+      </w:pPr>
+      <w:r>
+        <w:rPr>
+          <w:i/>
+          <w:iCs/>
+          <w:color w:val="555555"/>
+          <w:sz w:val="18"/>
+          <w:szCs w:val="18"/>
+        </w:rPr>
+        <w:t xml:space="preserve">▲ Danh sách SAR — bấm “+ Tạo SAR” hoặc bấm tiêu đề để soạn.</w:t>
+      </w:r>
+    </w:p>
+    <w:p>
+      <w:pPr>
+        <w:spacing w:after="20" w:before="100"/>
+        <w:jc w:val="center"/>
+      </w:pPr>
+      <w:r>
+        <w:drawing>
+          <wp:inline distT="0" distB="0" distL="0" distR="0">
+            <wp:extent cx="5715000" cy="3571875"/>
+            <wp:effectExtent t="0" r="0" b="0" l="0"/>
+            <wp:docPr id="1" name="" descr="" title=""/>
+            <wp:cNvGraphicFramePr>
+              <a:graphicFrameLocks xmlns:a="http://schemas.openxmlformats.org/drawingml/2006/main" noChangeAspect="1"/>
+            </wp:cNvGraphicFramePr>
+            <a:graphic xmlns:a="http://schemas.openxmlformats.org/drawingml/2006/main">
+              <a:graphicData uri="http://schemas.openxmlformats.org/drawingml/2006/picture">
+                <pic:pic xmlns:pic="http://schemas.openxmlformats.org/drawingml/2006/picture">
+                  <pic:nvPicPr>
+                    <pic:cNvPr id="0" name="" descr=""/>
+                    <pic:cNvPicPr>
+                      <a:picLocks noChangeAspect="1" noChangeArrowheads="1"/>
+                    </pic:cNvPicPr>
+                  </pic:nvPicPr>
+                  <pic:blipFill>
+                    <a:blip r:embed="rId19" cstate="none"/>
+                    <a:srcRect/>
+                    <a:stretch>
+                      <a:fillRect/>
+                    </a:stretch>
+                  </pic:blipFill>
+                  <pic:spPr bwMode="auto">
+                    <a:xfrm>
+                      <a:off x="0" y="0"/>
+                      <a:ext cx="5715000" cy="3571875"/>
+                    </a:xfrm>
+                    <a:prstGeom prst="rect">
+                      <a:avLst/>
+                    </a:prstGeom>
+                  </pic:spPr>
+                </pic:pic>
+              </a:graphicData>
+            </a:graphic>
+          </wp:inline>
+        </w:drawing>
+      </w:r>
+    </w:p>
+    <w:p>
+      <w:pPr>
+        <w:spacing w:after="140"/>
+        <w:jc w:val="center"/>
+      </w:pPr>
+      <w:r>
+        <w:rPr>
+          <w:i/>
+          <w:iCs/>
+          <w:color w:val="555555"/>
+          <w:sz w:val="18"/>
+          <w:szCs w:val="18"/>
+        </w:rPr>
+        <w:t xml:space="preserve">▲ Hộp thoại tạo SAR: chọn CTĐT→phiên bản và đợt, nhập tiêu đề.</w:t>
+      </w:r>
+    </w:p>
+    <w:p>
+      <w:pPr>
+        <w:spacing w:after="20" w:before="100"/>
+        <w:jc w:val="center"/>
+      </w:pPr>
+      <w:r>
+        <w:drawing>
+          <wp:inline distT="0" distB="0" distL="0" distR="0">
+            <wp:extent cx="5715000" cy="3571875"/>
+            <wp:effectExtent t="0" r="0" b="0" l="0"/>
+            <wp:docPr id="1" name="" descr="" title=""/>
+            <wp:cNvGraphicFramePr>
+              <a:graphicFrameLocks xmlns:a="http://schemas.openxmlformats.org/drawingml/2006/main" noChangeAspect="1"/>
+            </wp:cNvGraphicFramePr>
+            <a:graphic xmlns:a="http://schemas.openxmlformats.org/drawingml/2006/main">
+              <a:graphicData uri="http://schemas.openxmlformats.org/drawingml/2006/picture">
+                <pic:pic xmlns:pic="http://schemas.openxmlformats.org/drawingml/2006/picture">
+                  <pic:nvPicPr>
+                    <pic:cNvPr id="0" name="" descr=""/>
+                    <pic:cNvPicPr>
+                      <a:picLocks noChangeAspect="1" noChangeArrowheads="1"/>
+                    </pic:cNvPicPr>
+                  </pic:nvPicPr>
+                  <pic:blipFill>
+                    <a:blip r:embed="rId20" cstate="none"/>
+                    <a:srcRect/>
+                    <a:stretch>
+                      <a:fillRect/>
+                    </a:stretch>
+                  </pic:blipFill>
+                  <pic:spPr bwMode="auto">
+                    <a:xfrm>
+                      <a:off x="0" y="0"/>
+                      <a:ext cx="5715000" cy="3571875"/>
+                    </a:xfrm>
+                    <a:prstGeom prst="rect">
+                      <a:avLst/>
+                    </a:prstGeom>
+                  </pic:spPr>
+                </pic:pic>
+              </a:graphicData>
+            </a:graphic>
+          </wp:inline>
+        </w:drawing>
+      </w:r>
+    </w:p>
+    <w:p>
+      <w:pPr>
+        <w:spacing w:after="140"/>
+        <w:jc w:val="center"/>
+      </w:pPr>
+      <w:r>
+        <w:rPr>
+          <w:i/>
+          <w:iCs/>
+          <w:color w:val="555555"/>
+          <w:sz w:val="18"/>
+          <w:szCs w:val="18"/>
+        </w:rPr>
+        <w:t xml:space="preserve">▲ Trình soạn SAR: nhập liệu từng tiêu chí, chấm điểm, đổi trạng thái.</w:t>
+      </w:r>
+    </w:p>
+    <w:p>
+      <w:pPr>
+        <w:spacing w:after="20" w:before="100"/>
+        <w:jc w:val="center"/>
+      </w:pPr>
+      <w:r>
+        <w:drawing>
+          <wp:inline distT="0" distB="0" distL="0" distR="0">
+            <wp:extent cx="5715000" cy="3571875"/>
+            <wp:effectExtent t="0" r="0" b="0" l="0"/>
+            <wp:docPr id="1" name="" descr="" title=""/>
+            <wp:cNvGraphicFramePr>
+              <a:graphicFrameLocks xmlns:a="http://schemas.openxmlformats.org/drawingml/2006/main" noChangeAspect="1"/>
+            </wp:cNvGraphicFramePr>
+            <a:graphic xmlns:a="http://schemas.openxmlformats.org/drawingml/2006/main">
+              <a:graphicData uri="http://schemas.openxmlformats.org/drawingml/2006/picture">
+                <pic:pic xmlns:pic="http://schemas.openxmlformats.org/drawingml/2006/picture">
+                  <pic:nvPicPr>
+                    <pic:cNvPr id="0" name="" descr=""/>
+                    <pic:cNvPicPr>
+                      <a:picLocks noChangeAspect="1" noChangeArrowheads="1"/>
+                    </pic:cNvPicPr>
+                  </pic:nvPicPr>
+                  <pic:blipFill>
+                    <a:blip r:embed="rId21" cstate="none"/>
+                    <a:srcRect/>
+                    <a:stretch>
+                      <a:fillRect/>
+                    </a:stretch>
+                  </pic:blipFill>
+                  <pic:spPr bwMode="auto">
+                    <a:xfrm>
+                      <a:off x="0" y="0"/>
+                      <a:ext cx="5715000" cy="3571875"/>
+                    </a:xfrm>
+                    <a:prstGeom prst="rect">
+                      <a:avLst/>
+                    </a:prstGeom>
+                  </pic:spPr>
+                </pic:pic>
+              </a:graphicData>
+            </a:graphic>
+          </wp:inline>
+        </w:drawing>
+      </w:r>
+    </w:p>
+    <w:p>
+      <w:pPr>
+        <w:spacing w:after="140"/>
+        <w:jc w:val="center"/>
+      </w:pPr>
+      <w:r>
+        <w:rPr>
+          <w:i/>
+          <w:iCs/>
+          <w:color w:val="555555"/>
+          <w:sz w:val="18"/>
+          <w:szCs w:val="18"/>
+        </w:rPr>
+        <w:t xml:space="preserve">▲ Panel AI: bấm “AI viết nháp”, xem bản nháp rồi “Duyệt &amp; ghi vào báo cáo”.</w:t>
+      </w:r>
+    </w:p>
+    <w:p>
+      <w:pPr>
+        <w:spacing w:after="20" w:before="100"/>
+        <w:jc w:val="center"/>
+      </w:pPr>
+      <w:r>
+        <w:drawing>
+          <wp:inline distT="0" distB="0" distL="0" distR="0">
+            <wp:extent cx="5715000" cy="3571875"/>
+            <wp:effectExtent t="0" r="0" b="0" l="0"/>
+            <wp:docPr id="1" name="" descr="" title=""/>
+            <wp:cNvGraphicFramePr>
+              <a:graphicFrameLocks xmlns:a="http://schemas.openxmlformats.org/drawingml/2006/main" noChangeAspect="1"/>
+            </wp:cNvGraphicFramePr>
+            <a:graphic xmlns:a="http://schemas.openxmlformats.org/drawingml/2006/main">
+              <a:graphicData uri="http://schemas.openxmlformats.org/drawingml/2006/picture">
+                <pic:pic xmlns:pic="http://schemas.openxmlformats.org/drawingml/2006/picture">
+                  <pic:nvPicPr>
+                    <pic:cNvPr id="0" name="" descr=""/>
+                    <pic:cNvPicPr>
+                      <a:picLocks noChangeAspect="1" noChangeArrowheads="1"/>
+                    </pic:cNvPicPr>
+                  </pic:nvPicPr>
+                  <pic:blipFill>
+                    <a:blip r:embed="rId22" cstate="none"/>
+                    <a:srcRect/>
+                    <a:stretch>
+                      <a:fillRect/>
+                    </a:stretch>
+                  </pic:blipFill>
+                  <pic:spPr bwMode="auto">
+                    <a:xfrm>
+                      <a:off x="0" y="0"/>
+                      <a:ext cx="5715000" cy="3571875"/>
+                    </a:xfrm>
+                    <a:prstGeom prst="rect">
+                      <a:avLst/>
+                    </a:prstGeom>
+                  </pic:spPr>
+                </pic:pic>
+              </a:graphicData>
+            </a:graphic>
+          </wp:inline>
+        </w:drawing>
+      </w:r>
+    </w:p>
+    <w:p>
+      <w:pPr>
+        <w:spacing w:after="140"/>
+        <w:jc w:val="center"/>
+      </w:pPr>
+      <w:r>
+        <w:rPr>
+          <w:i/>
+          <w:iCs/>
+          <w:color w:val="555555"/>
+          <w:sz w:val="18"/>
+          <w:szCs w:val="18"/>
+        </w:rPr>
+        <w:t xml:space="preserve">▲ Tab Đánh giá nội bộ: chấm điểm và tổng hợp/so sánh giữa các thành viên.</w:t>
+      </w:r>
+    </w:p>
+    <w:p>
+      <w:pPr>
         <w:pStyle w:val="Heading2"/>
         <w:spacing w:after="80" w:before="200"/>
       </w:pPr>
@@ -2795,6 +3787,130 @@
     </w:p>
     <w:p>
       <w:pPr>
+        <w:spacing w:after="20" w:before="100"/>
+        <w:jc w:val="center"/>
+      </w:pPr>
+      <w:r>
+        <w:drawing>
+          <wp:inline distT="0" distB="0" distL="0" distR="0">
+            <wp:extent cx="5715000" cy="3571875"/>
+            <wp:effectExtent t="0" r="0" b="0" l="0"/>
+            <wp:docPr id="1" name="" descr="" title=""/>
+            <wp:cNvGraphicFramePr>
+              <a:graphicFrameLocks xmlns:a="http://schemas.openxmlformats.org/drawingml/2006/main" noChangeAspect="1"/>
+            </wp:cNvGraphicFramePr>
+            <a:graphic xmlns:a="http://schemas.openxmlformats.org/drawingml/2006/main">
+              <a:graphicData uri="http://schemas.openxmlformats.org/drawingml/2006/picture">
+                <pic:pic xmlns:pic="http://schemas.openxmlformats.org/drawingml/2006/picture">
+                  <pic:nvPicPr>
+                    <pic:cNvPr id="0" name="" descr=""/>
+                    <pic:cNvPicPr>
+                      <a:picLocks noChangeAspect="1" noChangeArrowheads="1"/>
+                    </pic:cNvPicPr>
+                  </pic:nvPicPr>
+                  <pic:blipFill>
+                    <a:blip r:embed="rId23" cstate="none"/>
+                    <a:srcRect/>
+                    <a:stretch>
+                      <a:fillRect/>
+                    </a:stretch>
+                  </pic:blipFill>
+                  <pic:spPr bwMode="auto">
+                    <a:xfrm>
+                      <a:off x="0" y="0"/>
+                      <a:ext cx="5715000" cy="3571875"/>
+                    </a:xfrm>
+                    <a:prstGeom prst="rect">
+                      <a:avLst/>
+                    </a:prstGeom>
+                  </pic:spPr>
+                </pic:pic>
+              </a:graphicData>
+            </a:graphic>
+          </wp:inline>
+        </w:drawing>
+      </w:r>
+    </w:p>
+    <w:p>
+      <w:pPr>
+        <w:spacing w:after="140"/>
+        <w:jc w:val="center"/>
+      </w:pPr>
+      <w:r>
+        <w:rPr>
+          <w:i/>
+          <w:iCs/>
+          <w:color w:val="555555"/>
+          <w:sz w:val="18"/>
+          <w:szCs w:val="18"/>
+        </w:rPr>
+        <w:t xml:space="preserve">▲ Kho minh chứng: tự đánh mã MC-XXXX, lọc, bấm tên để mở chi tiết.</w:t>
+      </w:r>
+    </w:p>
+    <w:p>
+      <w:pPr>
+        <w:spacing w:after="20" w:before="100"/>
+        <w:jc w:val="center"/>
+      </w:pPr>
+      <w:r>
+        <w:drawing>
+          <wp:inline distT="0" distB="0" distL="0" distR="0">
+            <wp:extent cx="5715000" cy="3571875"/>
+            <wp:effectExtent t="0" r="0" b="0" l="0"/>
+            <wp:docPr id="1" name="" descr="" title=""/>
+            <wp:cNvGraphicFramePr>
+              <a:graphicFrameLocks xmlns:a="http://schemas.openxmlformats.org/drawingml/2006/main" noChangeAspect="1"/>
+            </wp:cNvGraphicFramePr>
+            <a:graphic xmlns:a="http://schemas.openxmlformats.org/drawingml/2006/main">
+              <a:graphicData uri="http://schemas.openxmlformats.org/drawingml/2006/picture">
+                <pic:pic xmlns:pic="http://schemas.openxmlformats.org/drawingml/2006/picture">
+                  <pic:nvPicPr>
+                    <pic:cNvPr id="0" name="" descr=""/>
+                    <pic:cNvPicPr>
+                      <a:picLocks noChangeAspect="1" noChangeArrowheads="1"/>
+                    </pic:cNvPicPr>
+                  </pic:nvPicPr>
+                  <pic:blipFill>
+                    <a:blip r:embed="rId24" cstate="none"/>
+                    <a:srcRect/>
+                    <a:stretch>
+                      <a:fillRect/>
+                    </a:stretch>
+                  </pic:blipFill>
+                  <pic:spPr bwMode="auto">
+                    <a:xfrm>
+                      <a:off x="0" y="0"/>
+                      <a:ext cx="5715000" cy="3571875"/>
+                    </a:xfrm>
+                    <a:prstGeom prst="rect">
+                      <a:avLst/>
+                    </a:prstGeom>
+                  </pic:spPr>
+                </pic:pic>
+              </a:graphicData>
+            </a:graphic>
+          </wp:inline>
+        </w:drawing>
+      </w:r>
+    </w:p>
+    <w:p>
+      <w:pPr>
+        <w:spacing w:after="140"/>
+        <w:jc w:val="center"/>
+      </w:pPr>
+      <w:r>
+        <w:rPr>
+          <w:i/>
+          <w:iCs/>
+          <w:color w:val="555555"/>
+          <w:sz w:val="18"/>
+          <w:szCs w:val="18"/>
+        </w:rPr>
+        <w:t xml:space="preserve">▲ Chi tiết minh chứng: kéo-thả upload file, liên kết tiêu chí, xác minh.</w:t>
+      </w:r>
+    </w:p>
+    <w:p>
+      <w:pPr>
         <w:pStyle w:val="Heading2"/>
         <w:spacing w:after="80" w:before="200"/>
       </w:pPr>
@@ -2816,6 +3932,254 @@
     </w:p>
     <w:p>
       <w:pPr>
+        <w:spacing w:after="20" w:before="100"/>
+        <w:jc w:val="center"/>
+      </w:pPr>
+      <w:r>
+        <w:drawing>
+          <wp:inline distT="0" distB="0" distL="0" distR="0">
+            <wp:extent cx="5715000" cy="3571875"/>
+            <wp:effectExtent t="0" r="0" b="0" l="0"/>
+            <wp:docPr id="1" name="" descr="" title=""/>
+            <wp:cNvGraphicFramePr>
+              <a:graphicFrameLocks xmlns:a="http://schemas.openxmlformats.org/drawingml/2006/main" noChangeAspect="1"/>
+            </wp:cNvGraphicFramePr>
+            <a:graphic xmlns:a="http://schemas.openxmlformats.org/drawingml/2006/main">
+              <a:graphicData uri="http://schemas.openxmlformats.org/drawingml/2006/picture">
+                <pic:pic xmlns:pic="http://schemas.openxmlformats.org/drawingml/2006/picture">
+                  <pic:nvPicPr>
+                    <pic:cNvPr id="0" name="" descr=""/>
+                    <pic:cNvPicPr>
+                      <a:picLocks noChangeAspect="1" noChangeArrowheads="1"/>
+                    </pic:cNvPicPr>
+                  </pic:nvPicPr>
+                  <pic:blipFill>
+                    <a:blip r:embed="rId25" cstate="none"/>
+                    <a:srcRect/>
+                    <a:stretch>
+                      <a:fillRect/>
+                    </a:stretch>
+                  </pic:blipFill>
+                  <pic:spPr bwMode="auto">
+                    <a:xfrm>
+                      <a:off x="0" y="0"/>
+                      <a:ext cx="5715000" cy="3571875"/>
+                    </a:xfrm>
+                    <a:prstGeom prst="rect">
+                      <a:avLst/>
+                    </a:prstGeom>
+                  </pic:spPr>
+                </pic:pic>
+              </a:graphicData>
+            </a:graphic>
+          </wp:inline>
+        </w:drawing>
+      </w:r>
+    </w:p>
+    <w:p>
+      <w:pPr>
+        <w:spacing w:after="140"/>
+        <w:jc w:val="center"/>
+      </w:pPr>
+      <w:r>
+        <w:rPr>
+          <w:i/>
+          <w:iCs/>
+          <w:color w:val="555555"/>
+          <w:sz w:val="18"/>
+          <w:szCs w:val="18"/>
+        </w:rPr>
+        <w:t xml:space="preserve">▲ Đội ngũ giảng viên (tiêu chí C5).</w:t>
+      </w:r>
+    </w:p>
+    <w:p>
+      <w:pPr>
+        <w:spacing w:after="20" w:before="100"/>
+        <w:jc w:val="center"/>
+      </w:pPr>
+      <w:r>
+        <w:drawing>
+          <wp:inline distT="0" distB="0" distL="0" distR="0">
+            <wp:extent cx="5715000" cy="3571875"/>
+            <wp:effectExtent t="0" r="0" b="0" l="0"/>
+            <wp:docPr id="1" name="" descr="" title=""/>
+            <wp:cNvGraphicFramePr>
+              <a:graphicFrameLocks xmlns:a="http://schemas.openxmlformats.org/drawingml/2006/main" noChangeAspect="1"/>
+            </wp:cNvGraphicFramePr>
+            <a:graphic xmlns:a="http://schemas.openxmlformats.org/drawingml/2006/main">
+              <a:graphicData uri="http://schemas.openxmlformats.org/drawingml/2006/picture">
+                <pic:pic xmlns:pic="http://schemas.openxmlformats.org/drawingml/2006/picture">
+                  <pic:nvPicPr>
+                    <pic:cNvPr id="0" name="" descr=""/>
+                    <pic:cNvPicPr>
+                      <a:picLocks noChangeAspect="1" noChangeArrowheads="1"/>
+                    </pic:cNvPicPr>
+                  </pic:nvPicPr>
+                  <pic:blipFill>
+                    <a:blip r:embed="rId26" cstate="none"/>
+                    <a:srcRect/>
+                    <a:stretch>
+                      <a:fillRect/>
+                    </a:stretch>
+                  </pic:blipFill>
+                  <pic:spPr bwMode="auto">
+                    <a:xfrm>
+                      <a:off x="0" y="0"/>
+                      <a:ext cx="5715000" cy="3571875"/>
+                    </a:xfrm>
+                    <a:prstGeom prst="rect">
+                      <a:avLst/>
+                    </a:prstGeom>
+                  </pic:spPr>
+                </pic:pic>
+              </a:graphicData>
+            </a:graphic>
+          </wp:inline>
+        </w:drawing>
+      </w:r>
+    </w:p>
+    <w:p>
+      <w:pPr>
+        <w:spacing w:after="140"/>
+        <w:jc w:val="center"/>
+      </w:pPr>
+      <w:r>
+        <w:rPr>
+          <w:i/>
+          <w:iCs/>
+          <w:color w:val="555555"/>
+          <w:sz w:val="18"/>
+          <w:szCs w:val="18"/>
+        </w:rPr>
+        <w:t xml:space="preserve">▲ Người học &amp; dịch vụ hỗ trợ (tiêu chí C6).</w:t>
+      </w:r>
+    </w:p>
+    <w:p>
+      <w:pPr>
+        <w:spacing w:after="20" w:before="100"/>
+        <w:jc w:val="center"/>
+      </w:pPr>
+      <w:r>
+        <w:drawing>
+          <wp:inline distT="0" distB="0" distL="0" distR="0">
+            <wp:extent cx="5715000" cy="3571875"/>
+            <wp:effectExtent t="0" r="0" b="0" l="0"/>
+            <wp:docPr id="1" name="" descr="" title=""/>
+            <wp:cNvGraphicFramePr>
+              <a:graphicFrameLocks xmlns:a="http://schemas.openxmlformats.org/drawingml/2006/main" noChangeAspect="1"/>
+            </wp:cNvGraphicFramePr>
+            <a:graphic xmlns:a="http://schemas.openxmlformats.org/drawingml/2006/main">
+              <a:graphicData uri="http://schemas.openxmlformats.org/drawingml/2006/picture">
+                <pic:pic xmlns:pic="http://schemas.openxmlformats.org/drawingml/2006/picture">
+                  <pic:nvPicPr>
+                    <pic:cNvPr id="0" name="" descr=""/>
+                    <pic:cNvPicPr>
+                      <a:picLocks noChangeAspect="1" noChangeArrowheads="1"/>
+                    </pic:cNvPicPr>
+                  </pic:nvPicPr>
+                  <pic:blipFill>
+                    <a:blip r:embed="rId27" cstate="none"/>
+                    <a:srcRect/>
+                    <a:stretch>
+                      <a:fillRect/>
+                    </a:stretch>
+                  </pic:blipFill>
+                  <pic:spPr bwMode="auto">
+                    <a:xfrm>
+                      <a:off x="0" y="0"/>
+                      <a:ext cx="5715000" cy="3571875"/>
+                    </a:xfrm>
+                    <a:prstGeom prst="rect">
+                      <a:avLst/>
+                    </a:prstGeom>
+                  </pic:spPr>
+                </pic:pic>
+              </a:graphicData>
+            </a:graphic>
+          </wp:inline>
+        </w:drawing>
+      </w:r>
+    </w:p>
+    <w:p>
+      <w:pPr>
+        <w:spacing w:after="140"/>
+        <w:jc w:val="center"/>
+      </w:pPr>
+      <w:r>
+        <w:rPr>
+          <w:i/>
+          <w:iCs/>
+          <w:color w:val="555555"/>
+          <w:sz w:val="18"/>
+          <w:szCs w:val="18"/>
+        </w:rPr>
+        <w:t xml:space="preserve">▲ Cơ sở vật chất (tiêu chí C7).</w:t>
+      </w:r>
+    </w:p>
+    <w:p>
+      <w:pPr>
+        <w:spacing w:after="20" w:before="100"/>
+        <w:jc w:val="center"/>
+      </w:pPr>
+      <w:r>
+        <w:drawing>
+          <wp:inline distT="0" distB="0" distL="0" distR="0">
+            <wp:extent cx="5715000" cy="3571875"/>
+            <wp:effectExtent t="0" r="0" b="0" l="0"/>
+            <wp:docPr id="1" name="" descr="" title=""/>
+            <wp:cNvGraphicFramePr>
+              <a:graphicFrameLocks xmlns:a="http://schemas.openxmlformats.org/drawingml/2006/main" noChangeAspect="1"/>
+            </wp:cNvGraphicFramePr>
+            <a:graphic xmlns:a="http://schemas.openxmlformats.org/drawingml/2006/main">
+              <a:graphicData uri="http://schemas.openxmlformats.org/drawingml/2006/picture">
+                <pic:pic xmlns:pic="http://schemas.openxmlformats.org/drawingml/2006/picture">
+                  <pic:nvPicPr>
+                    <pic:cNvPr id="0" name="" descr=""/>
+                    <pic:cNvPicPr>
+                      <a:picLocks noChangeAspect="1" noChangeArrowheads="1"/>
+                    </pic:cNvPicPr>
+                  </pic:nvPicPr>
+                  <pic:blipFill>
+                    <a:blip r:embed="rId28" cstate="none"/>
+                    <a:srcRect/>
+                    <a:stretch>
+                      <a:fillRect/>
+                    </a:stretch>
+                  </pic:blipFill>
+                  <pic:spPr bwMode="auto">
+                    <a:xfrm>
+                      <a:off x="0" y="0"/>
+                      <a:ext cx="5715000" cy="3571875"/>
+                    </a:xfrm>
+                    <a:prstGeom prst="rect">
+                      <a:avLst/>
+                    </a:prstGeom>
+                  </pic:spPr>
+                </pic:pic>
+              </a:graphicData>
+            </a:graphic>
+          </wp:inline>
+        </w:drawing>
+      </w:r>
+    </w:p>
+    <w:p>
+      <w:pPr>
+        <w:spacing w:after="140"/>
+        <w:jc w:val="center"/>
+      </w:pPr>
+      <w:r>
+        <w:rPr>
+          <w:i/>
+          <w:iCs/>
+          <w:color w:val="555555"/>
+          <w:sz w:val="18"/>
+          <w:szCs w:val="18"/>
+        </w:rPr>
+        <w:t xml:space="preserve">▲ Kết quả đầu ra (tiêu chí C8).</w:t>
+      </w:r>
+    </w:p>
+    <w:p>
+      <w:pPr>
         <w:pStyle w:val="Heading2"/>
         <w:spacing w:after="80" w:before="200"/>
       </w:pPr>
@@ -2855,6 +4219,68 @@
     </w:p>
     <w:p>
       <w:pPr>
+        <w:spacing w:after="20" w:before="100"/>
+        <w:jc w:val="center"/>
+      </w:pPr>
+      <w:r>
+        <w:drawing>
+          <wp:inline distT="0" distB="0" distL="0" distR="0">
+            <wp:extent cx="5715000" cy="3571875"/>
+            <wp:effectExtent t="0" r="0" b="0" l="0"/>
+            <wp:docPr id="1" name="" descr="" title=""/>
+            <wp:cNvGraphicFramePr>
+              <a:graphicFrameLocks xmlns:a="http://schemas.openxmlformats.org/drawingml/2006/main" noChangeAspect="1"/>
+            </wp:cNvGraphicFramePr>
+            <a:graphic xmlns:a="http://schemas.openxmlformats.org/drawingml/2006/main">
+              <a:graphicData uri="http://schemas.openxmlformats.org/drawingml/2006/picture">
+                <pic:pic xmlns:pic="http://schemas.openxmlformats.org/drawingml/2006/picture">
+                  <pic:nvPicPr>
+                    <pic:cNvPr id="0" name="" descr=""/>
+                    <pic:cNvPicPr>
+                      <a:picLocks noChangeAspect="1" noChangeArrowheads="1"/>
+                    </pic:cNvPicPr>
+                  </pic:nvPicPr>
+                  <pic:blipFill>
+                    <a:blip r:embed="rId29" cstate="none"/>
+                    <a:srcRect/>
+                    <a:stretch>
+                      <a:fillRect/>
+                    </a:stretch>
+                  </pic:blipFill>
+                  <pic:spPr bwMode="auto">
+                    <a:xfrm>
+                      <a:off x="0" y="0"/>
+                      <a:ext cx="5715000" cy="3571875"/>
+                    </a:xfrm>
+                    <a:prstGeom prst="rect">
+                      <a:avLst/>
+                    </a:prstGeom>
+                  </pic:spPr>
+                </pic:pic>
+              </a:graphicData>
+            </a:graphic>
+          </wp:inline>
+        </w:drawing>
+      </w:r>
+    </w:p>
+    <w:p>
+      <w:pPr>
+        <w:spacing w:after="140"/>
+        <w:jc w:val="center"/>
+      </w:pPr>
+      <w:r>
+        <w:rPr>
+          <w:i/>
+          <w:iCs/>
+          <w:color w:val="555555"/>
+          <w:sz w:val="18"/>
+          <w:szCs w:val="18"/>
+        </w:rPr>
+        <w:t xml:space="preserve">▲ Bảng Kanban: kéo-thả thẻ giữa các cột để đổi trạng thái nhiệm vụ.</w:t>
+      </w:r>
+    </w:p>
+    <w:p>
+      <w:pPr>
         <w:pStyle w:val="Heading2"/>
         <w:spacing w:after="80" w:before="200"/>
       </w:pPr>
@@ -2907,6 +4333,130 @@
     </w:p>
     <w:p>
       <w:pPr>
+        <w:spacing w:after="20" w:before="100"/>
+        <w:jc w:val="center"/>
+      </w:pPr>
+      <w:r>
+        <w:drawing>
+          <wp:inline distT="0" distB="0" distL="0" distR="0">
+            <wp:extent cx="5715000" cy="3571875"/>
+            <wp:effectExtent t="0" r="0" b="0" l="0"/>
+            <wp:docPr id="1" name="" descr="" title=""/>
+            <wp:cNvGraphicFramePr>
+              <a:graphicFrameLocks xmlns:a="http://schemas.openxmlformats.org/drawingml/2006/main" noChangeAspect="1"/>
+            </wp:cNvGraphicFramePr>
+            <a:graphic xmlns:a="http://schemas.openxmlformats.org/drawingml/2006/main">
+              <a:graphicData uri="http://schemas.openxmlformats.org/drawingml/2006/picture">
+                <pic:pic xmlns:pic="http://schemas.openxmlformats.org/drawingml/2006/picture">
+                  <pic:nvPicPr>
+                    <pic:cNvPr id="0" name="" descr=""/>
+                    <pic:cNvPicPr>
+                      <a:picLocks noChangeAspect="1" noChangeArrowheads="1"/>
+                    </pic:cNvPicPr>
+                  </pic:nvPicPr>
+                  <pic:blipFill>
+                    <a:blip r:embed="rId30" cstate="none"/>
+                    <a:srcRect/>
+                    <a:stretch>
+                      <a:fillRect/>
+                    </a:stretch>
+                  </pic:blipFill>
+                  <pic:spPr bwMode="auto">
+                    <a:xfrm>
+                      <a:off x="0" y="0"/>
+                      <a:ext cx="5715000" cy="3571875"/>
+                    </a:xfrm>
+                    <a:prstGeom prst="rect">
+                      <a:avLst/>
+                    </a:prstGeom>
+                  </pic:spPr>
+                </pic:pic>
+              </a:graphicData>
+            </a:graphic>
+          </wp:inline>
+        </w:drawing>
+      </w:r>
+    </w:p>
+    <w:p>
+      <w:pPr>
+        <w:spacing w:after="140"/>
+        <w:jc w:val="center"/>
+      </w:pPr>
+      <w:r>
+        <w:rPr>
+          <w:i/>
+          <w:iCs/>
+          <w:color w:val="555555"/>
+          <w:sz w:val="18"/>
+          <w:szCs w:val="18"/>
+        </w:rPr>
+        <w:t xml:space="preserve">▲ Danh sách kế hoạch cải tiến — bấm tên để mở chi tiết.</w:t>
+      </w:r>
+    </w:p>
+    <w:p>
+      <w:pPr>
+        <w:spacing w:after="20" w:before="100"/>
+        <w:jc w:val="center"/>
+      </w:pPr>
+      <w:r>
+        <w:drawing>
+          <wp:inline distT="0" distB="0" distL="0" distR="0">
+            <wp:extent cx="5715000" cy="3571875"/>
+            <wp:effectExtent t="0" r="0" b="0" l="0"/>
+            <wp:docPr id="1" name="" descr="" title=""/>
+            <wp:cNvGraphicFramePr>
+              <a:graphicFrameLocks xmlns:a="http://schemas.openxmlformats.org/drawingml/2006/main" noChangeAspect="1"/>
+            </wp:cNvGraphicFramePr>
+            <a:graphic xmlns:a="http://schemas.openxmlformats.org/drawingml/2006/main">
+              <a:graphicData uri="http://schemas.openxmlformats.org/drawingml/2006/picture">
+                <pic:pic xmlns:pic="http://schemas.openxmlformats.org/drawingml/2006/picture">
+                  <pic:nvPicPr>
+                    <pic:cNvPr id="0" name="" descr=""/>
+                    <pic:cNvPicPr>
+                      <a:picLocks noChangeAspect="1" noChangeArrowheads="1"/>
+                    </pic:cNvPicPr>
+                  </pic:nvPicPr>
+                  <pic:blipFill>
+                    <a:blip r:embed="rId31" cstate="none"/>
+                    <a:srcRect/>
+                    <a:stretch>
+                      <a:fillRect/>
+                    </a:stretch>
+                  </pic:blipFill>
+                  <pic:spPr bwMode="auto">
+                    <a:xfrm>
+                      <a:off x="0" y="0"/>
+                      <a:ext cx="5715000" cy="3571875"/>
+                    </a:xfrm>
+                    <a:prstGeom prst="rect">
+                      <a:avLst/>
+                    </a:prstGeom>
+                  </pic:spPr>
+                </pic:pic>
+              </a:graphicData>
+            </a:graphic>
+          </wp:inline>
+        </w:drawing>
+      </w:r>
+    </w:p>
+    <w:p>
+      <w:pPr>
+        <w:spacing w:after="140"/>
+        <w:jc w:val="center"/>
+      </w:pPr>
+      <w:r>
+        <w:rPr>
+          <w:i/>
+          <w:iCs/>
+          <w:color w:val="555555"/>
+          <w:sz w:val="18"/>
+          <w:szCs w:val="18"/>
+        </w:rPr>
+        <w:t xml:space="preserve">▲ Chi tiết: hành động theo pha PDCA, log tiến độ và KPI.</w:t>
+      </w:r>
+    </w:p>
+    <w:p>
+      <w:pPr>
         <w:pStyle w:val="Heading2"/>
         <w:spacing w:after="80" w:before="200"/>
       </w:pPr>
@@ -2972,6 +4522,192 @@
     </w:p>
     <w:p>
       <w:pPr>
+        <w:spacing w:after="20" w:before="100"/>
+        <w:jc w:val="center"/>
+      </w:pPr>
+      <w:r>
+        <w:drawing>
+          <wp:inline distT="0" distB="0" distL="0" distR="0">
+            <wp:extent cx="5715000" cy="3571875"/>
+            <wp:effectExtent t="0" r="0" b="0" l="0"/>
+            <wp:docPr id="1" name="" descr="" title=""/>
+            <wp:cNvGraphicFramePr>
+              <a:graphicFrameLocks xmlns:a="http://schemas.openxmlformats.org/drawingml/2006/main" noChangeAspect="1"/>
+            </wp:cNvGraphicFramePr>
+            <a:graphic xmlns:a="http://schemas.openxmlformats.org/drawingml/2006/main">
+              <a:graphicData uri="http://schemas.openxmlformats.org/drawingml/2006/picture">
+                <pic:pic xmlns:pic="http://schemas.openxmlformats.org/drawingml/2006/picture">
+                  <pic:nvPicPr>
+                    <pic:cNvPr id="0" name="" descr=""/>
+                    <pic:cNvPicPr>
+                      <a:picLocks noChangeAspect="1" noChangeArrowheads="1"/>
+                    </pic:cNvPicPr>
+                  </pic:nvPicPr>
+                  <pic:blipFill>
+                    <a:blip r:embed="rId32" cstate="none"/>
+                    <a:srcRect/>
+                    <a:stretch>
+                      <a:fillRect/>
+                    </a:stretch>
+                  </pic:blipFill>
+                  <pic:spPr bwMode="auto">
+                    <a:xfrm>
+                      <a:off x="0" y="0"/>
+                      <a:ext cx="5715000" cy="3571875"/>
+                    </a:xfrm>
+                    <a:prstGeom prst="rect">
+                      <a:avLst/>
+                    </a:prstGeom>
+                  </pic:spPr>
+                </pic:pic>
+              </a:graphicData>
+            </a:graphic>
+          </wp:inline>
+        </w:drawing>
+      </w:r>
+    </w:p>
+    <w:p>
+      <w:pPr>
+        <w:spacing w:after="140"/>
+        <w:jc w:val="center"/>
+      </w:pPr>
+      <w:r>
+        <w:rPr>
+          <w:i/>
+          <w:iCs/>
+          <w:color w:val="555555"/>
+          <w:sz w:val="18"/>
+          <w:szCs w:val="18"/>
+        </w:rPr>
+        <w:t xml:space="preserve">▲ Danh sách khảo sát.</w:t>
+      </w:r>
+    </w:p>
+    <w:p>
+      <w:pPr>
+        <w:spacing w:after="20" w:before="100"/>
+        <w:jc w:val="center"/>
+      </w:pPr>
+      <w:r>
+        <w:drawing>
+          <wp:inline distT="0" distB="0" distL="0" distR="0">
+            <wp:extent cx="5715000" cy="3571875"/>
+            <wp:effectExtent t="0" r="0" b="0" l="0"/>
+            <wp:docPr id="1" name="" descr="" title=""/>
+            <wp:cNvGraphicFramePr>
+              <a:graphicFrameLocks xmlns:a="http://schemas.openxmlformats.org/drawingml/2006/main" noChangeAspect="1"/>
+            </wp:cNvGraphicFramePr>
+            <a:graphic xmlns:a="http://schemas.openxmlformats.org/drawingml/2006/main">
+              <a:graphicData uri="http://schemas.openxmlformats.org/drawingml/2006/picture">
+                <pic:pic xmlns:pic="http://schemas.openxmlformats.org/drawingml/2006/picture">
+                  <pic:nvPicPr>
+                    <pic:cNvPr id="0" name="" descr=""/>
+                    <pic:cNvPicPr>
+                      <a:picLocks noChangeAspect="1" noChangeArrowheads="1"/>
+                    </pic:cNvPicPr>
+                  </pic:nvPicPr>
+                  <pic:blipFill>
+                    <a:blip r:embed="rId33" cstate="none"/>
+                    <a:srcRect/>
+                    <a:stretch>
+                      <a:fillRect/>
+                    </a:stretch>
+                  </pic:blipFill>
+                  <pic:spPr bwMode="auto">
+                    <a:xfrm>
+                      <a:off x="0" y="0"/>
+                      <a:ext cx="5715000" cy="3571875"/>
+                    </a:xfrm>
+                    <a:prstGeom prst="rect">
+                      <a:avLst/>
+                    </a:prstGeom>
+                  </pic:spPr>
+                </pic:pic>
+              </a:graphicData>
+            </a:graphic>
+          </wp:inline>
+        </w:drawing>
+      </w:r>
+    </w:p>
+    <w:p>
+      <w:pPr>
+        <w:spacing w:after="140"/>
+        <w:jc w:val="center"/>
+      </w:pPr>
+      <w:r>
+        <w:rPr>
+          <w:i/>
+          <w:iCs/>
+          <w:color w:val="555555"/>
+          <w:sz w:val="18"/>
+          <w:szCs w:val="18"/>
+        </w:rPr>
+        <w:t xml:space="preserve">▲ Chi tiết khảo sát: thêm câu hỏi, mở khảo sát (sinh link công khai), xem kết quả.</w:t>
+      </w:r>
+    </w:p>
+    <w:p>
+      <w:pPr>
+        <w:spacing w:after="20" w:before="100"/>
+        <w:jc w:val="center"/>
+      </w:pPr>
+      <w:r>
+        <w:drawing>
+          <wp:inline distT="0" distB="0" distL="0" distR="0">
+            <wp:extent cx="5715000" cy="3571875"/>
+            <wp:effectExtent t="0" r="0" b="0" l="0"/>
+            <wp:docPr id="1" name="" descr="" title=""/>
+            <wp:cNvGraphicFramePr>
+              <a:graphicFrameLocks xmlns:a="http://schemas.openxmlformats.org/drawingml/2006/main" noChangeAspect="1"/>
+            </wp:cNvGraphicFramePr>
+            <a:graphic xmlns:a="http://schemas.openxmlformats.org/drawingml/2006/main">
+              <a:graphicData uri="http://schemas.openxmlformats.org/drawingml/2006/picture">
+                <pic:pic xmlns:pic="http://schemas.openxmlformats.org/drawingml/2006/picture">
+                  <pic:nvPicPr>
+                    <pic:cNvPr id="0" name="" descr=""/>
+                    <pic:cNvPicPr>
+                      <a:picLocks noChangeAspect="1" noChangeArrowheads="1"/>
+                    </pic:cNvPicPr>
+                  </pic:nvPicPr>
+                  <pic:blipFill>
+                    <a:blip r:embed="rId34" cstate="none"/>
+                    <a:srcRect/>
+                    <a:stretch>
+                      <a:fillRect/>
+                    </a:stretch>
+                  </pic:blipFill>
+                  <pic:spPr bwMode="auto">
+                    <a:xfrm>
+                      <a:off x="0" y="0"/>
+                      <a:ext cx="5715000" cy="3571875"/>
+                    </a:xfrm>
+                    <a:prstGeom prst="rect">
+                      <a:avLst/>
+                    </a:prstGeom>
+                  </pic:spPr>
+                </pic:pic>
+              </a:graphicData>
+            </a:graphic>
+          </wp:inline>
+        </w:drawing>
+      </w:r>
+    </w:p>
+    <w:p>
+      <w:pPr>
+        <w:spacing w:after="140"/>
+        <w:jc w:val="center"/>
+      </w:pPr>
+      <w:r>
+        <w:rPr>
+          <w:i/>
+          <w:iCs/>
+          <w:color w:val="555555"/>
+          <w:sz w:val="18"/>
+          <w:szCs w:val="18"/>
+        </w:rPr>
+        <w:t xml:space="preserve">▲ Trang công khai: người ngoài điền khảo sát qua link, không cần đăng nhập.</w:t>
+      </w:r>
+    </w:p>
+    <w:p>
+      <w:pPr>
         <w:pStyle w:val="Heading2"/>
         <w:spacing w:after="80" w:before="200"/>
       </w:pPr>
@@ -3024,6 +4760,68 @@
     </w:p>
     <w:p>
       <w:pPr>
+        <w:spacing w:after="20" w:before="100"/>
+        <w:jc w:val="center"/>
+      </w:pPr>
+      <w:r>
+        <w:drawing>
+          <wp:inline distT="0" distB="0" distL="0" distR="0">
+            <wp:extent cx="5715000" cy="3571875"/>
+            <wp:effectExtent t="0" r="0" b="0" l="0"/>
+            <wp:docPr id="1" name="" descr="" title=""/>
+            <wp:cNvGraphicFramePr>
+              <a:graphicFrameLocks xmlns:a="http://schemas.openxmlformats.org/drawingml/2006/main" noChangeAspect="1"/>
+            </wp:cNvGraphicFramePr>
+            <a:graphic xmlns:a="http://schemas.openxmlformats.org/drawingml/2006/main">
+              <a:graphicData uri="http://schemas.openxmlformats.org/drawingml/2006/picture">
+                <pic:pic xmlns:pic="http://schemas.openxmlformats.org/drawingml/2006/picture">
+                  <pic:nvPicPr>
+                    <pic:cNvPr id="0" name="" descr=""/>
+                    <pic:cNvPicPr>
+                      <a:picLocks noChangeAspect="1" noChangeArrowheads="1"/>
+                    </pic:cNvPicPr>
+                  </pic:nvPicPr>
+                  <pic:blipFill>
+                    <a:blip r:embed="rId35" cstate="none"/>
+                    <a:srcRect/>
+                    <a:stretch>
+                      <a:fillRect/>
+                    </a:stretch>
+                  </pic:blipFill>
+                  <pic:spPr bwMode="auto">
+                    <a:xfrm>
+                      <a:off x="0" y="0"/>
+                      <a:ext cx="5715000" cy="3571875"/>
+                    </a:xfrm>
+                    <a:prstGeom prst="rect">
+                      <a:avLst/>
+                    </a:prstGeom>
+                  </pic:spPr>
+                </pic:pic>
+              </a:graphicData>
+            </a:graphic>
+          </wp:inline>
+        </w:drawing>
+      </w:r>
+    </w:p>
+    <w:p>
+      <w:pPr>
+        <w:spacing w:after="140"/>
+        <w:jc w:val="center"/>
+      </w:pPr>
+      <w:r>
+        <w:rPr>
+          <w:i/>
+          <w:iCs/>
+          <w:color w:val="555555"/>
+          <w:sz w:val="18"/>
+          <w:szCs w:val="18"/>
+        </w:rPr>
+        <w:t xml:space="preserve">▲ Xuất báo cáo: chọn loại, tạo yêu cầu và tải file khi hoàn tất.</w:t>
+      </w:r>
+    </w:p>
+    <w:p>
+      <w:pPr>
         <w:pStyle w:val="Heading2"/>
         <w:spacing w:after="80" w:before="200"/>
       </w:pPr>
@@ -3059,6 +4857,130 @@
       </w:pPr>
       <w:r>
         <w:t xml:space="preserve">Tab Khoa/Bộ môn: thêm Khoa, sau đó thêm Bộ môn (chọn khoa).</w:t>
+      </w:r>
+    </w:p>
+    <w:p>
+      <w:pPr>
+        <w:spacing w:after="20" w:before="100"/>
+        <w:jc w:val="center"/>
+      </w:pPr>
+      <w:r>
+        <w:drawing>
+          <wp:inline distT="0" distB="0" distL="0" distR="0">
+            <wp:extent cx="5715000" cy="3571875"/>
+            <wp:effectExtent t="0" r="0" b="0" l="0"/>
+            <wp:docPr id="1" name="" descr="" title=""/>
+            <wp:cNvGraphicFramePr>
+              <a:graphicFrameLocks xmlns:a="http://schemas.openxmlformats.org/drawingml/2006/main" noChangeAspect="1"/>
+            </wp:cNvGraphicFramePr>
+            <a:graphic xmlns:a="http://schemas.openxmlformats.org/drawingml/2006/main">
+              <a:graphicData uri="http://schemas.openxmlformats.org/drawingml/2006/picture">
+                <pic:pic xmlns:pic="http://schemas.openxmlformats.org/drawingml/2006/picture">
+                  <pic:nvPicPr>
+                    <pic:cNvPr id="0" name="" descr=""/>
+                    <pic:cNvPicPr>
+                      <a:picLocks noChangeAspect="1" noChangeArrowheads="1"/>
+                    </pic:cNvPicPr>
+                  </pic:nvPicPr>
+                  <pic:blipFill>
+                    <a:blip r:embed="rId36" cstate="none"/>
+                    <a:srcRect/>
+                    <a:stretch>
+                      <a:fillRect/>
+                    </a:stretch>
+                  </pic:blipFill>
+                  <pic:spPr bwMode="auto">
+                    <a:xfrm>
+                      <a:off x="0" y="0"/>
+                      <a:ext cx="5715000" cy="3571875"/>
+                    </a:xfrm>
+                    <a:prstGeom prst="rect">
+                      <a:avLst/>
+                    </a:prstGeom>
+                  </pic:spPr>
+                </pic:pic>
+              </a:graphicData>
+            </a:graphic>
+          </wp:inline>
+        </w:drawing>
+      </w:r>
+    </w:p>
+    <w:p>
+      <w:pPr>
+        <w:spacing w:after="140"/>
+        <w:jc w:val="center"/>
+      </w:pPr>
+      <w:r>
+        <w:rPr>
+          <w:i/>
+          <w:iCs/>
+          <w:color w:val="555555"/>
+          <w:sz w:val="18"/>
+          <w:szCs w:val="18"/>
+        </w:rPr>
+        <w:t xml:space="preserve">▲ Quản lý người dùng: tạo tài khoản và gán vai trò (RBAC).</w:t>
+      </w:r>
+    </w:p>
+    <w:p>
+      <w:pPr>
+        <w:spacing w:after="20" w:before="100"/>
+        <w:jc w:val="center"/>
+      </w:pPr>
+      <w:r>
+        <w:drawing>
+          <wp:inline distT="0" distB="0" distL="0" distR="0">
+            <wp:extent cx="5715000" cy="3571875"/>
+            <wp:effectExtent t="0" r="0" b="0" l="0"/>
+            <wp:docPr id="1" name="" descr="" title=""/>
+            <wp:cNvGraphicFramePr>
+              <a:graphicFrameLocks xmlns:a="http://schemas.openxmlformats.org/drawingml/2006/main" noChangeAspect="1"/>
+            </wp:cNvGraphicFramePr>
+            <a:graphic xmlns:a="http://schemas.openxmlformats.org/drawingml/2006/main">
+              <a:graphicData uri="http://schemas.openxmlformats.org/drawingml/2006/picture">
+                <pic:pic xmlns:pic="http://schemas.openxmlformats.org/drawingml/2006/picture">
+                  <pic:nvPicPr>
+                    <pic:cNvPr id="0" name="" descr=""/>
+                    <pic:cNvPicPr>
+                      <a:picLocks noChangeAspect="1" noChangeArrowheads="1"/>
+                    </pic:cNvPicPr>
+                  </pic:nvPicPr>
+                  <pic:blipFill>
+                    <a:blip r:embed="rId37" cstate="none"/>
+                    <a:srcRect/>
+                    <a:stretch>
+                      <a:fillRect/>
+                    </a:stretch>
+                  </pic:blipFill>
+                  <pic:spPr bwMode="auto">
+                    <a:xfrm>
+                      <a:off x="0" y="0"/>
+                      <a:ext cx="5715000" cy="3571875"/>
+                    </a:xfrm>
+                    <a:prstGeom prst="rect">
+                      <a:avLst/>
+                    </a:prstGeom>
+                  </pic:spPr>
+                </pic:pic>
+              </a:graphicData>
+            </a:graphic>
+          </wp:inline>
+        </w:drawing>
+      </w:r>
+    </w:p>
+    <w:p>
+      <w:pPr>
+        <w:spacing w:after="140"/>
+        <w:jc w:val="center"/>
+      </w:pPr>
+      <w:r>
+        <w:rPr>
+          <w:i/>
+          <w:iCs/>
+          <w:color w:val="555555"/>
+          <w:sz w:val="18"/>
+          <w:szCs w:val="18"/>
+        </w:rPr>
+        <w:t xml:space="preserve">▲ Quản lý Khoa/Bộ môn.</w:t>
       </w:r>
     </w:p>
     <w:p>
@@ -3131,6 +5053,68 @@
           <w:iCs/>
         </w:rPr>
         <w:t xml:space="preserve">Nếu không nhập API Key, hệ thống dùng chế độ mô phỏng (mock) để minh họa — không gửi dữ liệu ra ngoài.</w:t>
+      </w:r>
+    </w:p>
+    <w:p>
+      <w:pPr>
+        <w:spacing w:after="20" w:before="100"/>
+        <w:jc w:val="center"/>
+      </w:pPr>
+      <w:r>
+        <w:drawing>
+          <wp:inline distT="0" distB="0" distL="0" distR="0">
+            <wp:extent cx="5715000" cy="3571875"/>
+            <wp:effectExtent t="0" r="0" b="0" l="0"/>
+            <wp:docPr id="1" name="" descr="" title=""/>
+            <wp:cNvGraphicFramePr>
+              <a:graphicFrameLocks xmlns:a="http://schemas.openxmlformats.org/drawingml/2006/main" noChangeAspect="1"/>
+            </wp:cNvGraphicFramePr>
+            <a:graphic xmlns:a="http://schemas.openxmlformats.org/drawingml/2006/main">
+              <a:graphicData uri="http://schemas.openxmlformats.org/drawingml/2006/picture">
+                <pic:pic xmlns:pic="http://schemas.openxmlformats.org/drawingml/2006/picture">
+                  <pic:nvPicPr>
+                    <pic:cNvPr id="0" name="" descr=""/>
+                    <pic:cNvPicPr>
+                      <a:picLocks noChangeAspect="1" noChangeArrowheads="1"/>
+                    </pic:cNvPicPr>
+                  </pic:nvPicPr>
+                  <pic:blipFill>
+                    <a:blip r:embed="rId38" cstate="none"/>
+                    <a:srcRect/>
+                    <a:stretch>
+                      <a:fillRect/>
+                    </a:stretch>
+                  </pic:blipFill>
+                  <pic:spPr bwMode="auto">
+                    <a:xfrm>
+                      <a:off x="0" y="0"/>
+                      <a:ext cx="5715000" cy="3571875"/>
+                    </a:xfrm>
+                    <a:prstGeom prst="rect">
+                      <a:avLst/>
+                    </a:prstGeom>
+                  </pic:spPr>
+                </pic:pic>
+              </a:graphicData>
+            </a:graphic>
+          </wp:inline>
+        </w:drawing>
+      </w:r>
+    </w:p>
+    <w:p>
+      <w:pPr>
+        <w:spacing w:after="140"/>
+        <w:jc w:val="center"/>
+      </w:pPr>
+      <w:r>
+        <w:rPr>
+          <w:i/>
+          <w:iCs/>
+          <w:color w:val="555555"/>
+          <w:sz w:val="18"/>
+          <w:szCs w:val="18"/>
+        </w:rPr>
+        <w:t xml:space="preserve">▲ AI hỗ trợ: cấu hình AI, theo dõi chi phí/token, kiểm tra khoảng trống.</w:t>
       </w:r>
     </w:p>
     <w:p>

</xml_diff>

<commit_message>
docs: cập nhật Hướng dẫn sử dụng — thêm mục Trợ lý hướng dẫn theo màn hình
- Thêm mục 5.16 + ảnh 33-help-assistant; bổ sung dòng giới thiệu tính năng
- Tài liệu .docx nay 33 ảnh chụp màn hình

https://claude.ai/code/session_01Ra1ofbTJ9X2a54i9dhGJH6
</commit_message>
<xml_diff>
--- a/docs/Huong_dan_su_dung_AIQMS.docx
+++ b/docs/Huong_dan_su_dung_AIQMS.docx
@@ -266,6 +266,19 @@
       </w:pPr>
       <w:r>
         <w:t xml:space="preserve">Trợ lý AI: tóm tắt minh chứng, viết nháp SAR (có người duyệt), kiểm tra khoảng trống hồ sơ.</w:t>
+      </w:r>
+    </w:p>
+    <w:p>
+      <w:pPr>
+        <w:pStyle w:val="ListParagraph"/>
+        <w:numPr>
+          <w:ilvl w:val="0"/>
+          <w:numId w:val="2"/>
+        </w:numPr>
+        <w:spacing w:after="40"/>
+      </w:pPr>
+      <w:r>
+        <w:t xml:space="preserve">Trợ lý hướng dẫn theo màn hình: nút “?” ở mọi trang chỉ rõ “việc cần làm” + ô Hỏi AI.</w:t>
       </w:r>
     </w:p>
     <w:p>
@@ -5115,6 +5128,148 @@
           <w:szCs w:val="18"/>
         </w:rPr>
         <w:t xml:space="preserve">▲ AI hỗ trợ: cấu hình AI, theo dõi chi phí/token, kiểm tra khoảng trống.</w:t>
+      </w:r>
+    </w:p>
+    <w:p>
+      <w:pPr>
+        <w:pStyle w:val="Heading2"/>
+        <w:spacing w:after="80" w:before="200"/>
+      </w:pPr>
+      <w:r>
+        <w:rPr>
+          <w:b/>
+          <w:bCs/>
+        </w:rPr>
+        <w:t xml:space="preserve">5.16. Trợ lý hướng dẫn theo màn hình (AI)</w:t>
+      </w:r>
+    </w:p>
+    <w:p>
+      <w:pPr>
+        <w:spacing w:after="80"/>
+      </w:pPr>
+      <w:r>
+        <w:t xml:space="preserve">Ở MỌI màn hình đều có nút tròn “?” màu tím ở góc dưới bên phải. Bấm vào để mở bảng trợ lý hướng dẫn.</w:t>
+      </w:r>
+    </w:p>
+    <w:p>
+      <w:pPr>
+        <w:pStyle w:val="ListParagraph"/>
+        <w:numPr>
+          <w:ilvl w:val="0"/>
+          <w:numId w:val="3"/>
+        </w:numPr>
+        <w:spacing w:after="40"/>
+      </w:pPr>
+      <w:r>
+        <w:t xml:space="preserve">Bấm nút “?” (góc dưới phải) để mở bảng Trợ lý hướng dẫn.</w:t>
+      </w:r>
+    </w:p>
+    <w:p>
+      <w:pPr>
+        <w:pStyle w:val="ListParagraph"/>
+        <w:numPr>
+          <w:ilvl w:val="0"/>
+          <w:numId w:val="3"/>
+        </w:numPr>
+        <w:spacing w:after="40"/>
+      </w:pPr>
+      <w:r>
+        <w:t xml:space="preserve">Đọc mục “Việc cần làm tại màn hình này” — các bước thao tác cụ thể cho đúng màn hình bạn đang xem.</w:t>
+      </w:r>
+    </w:p>
+    <w:p>
+      <w:pPr>
+        <w:pStyle w:val="ListParagraph"/>
+        <w:numPr>
+          <w:ilvl w:val="0"/>
+          <w:numId w:val="3"/>
+        </w:numPr>
+        <w:spacing w:after="40"/>
+      </w:pPr>
+      <w:r>
+        <w:t xml:space="preserve">Cần hỏi sâu hơn: gõ câu hỏi vào ô “Hỏi AI về màn hình này” rồi bấm “Hỏi AI” để nhận hướng dẫn từng bước.</w:t>
+      </w:r>
+    </w:p>
+    <w:p>
+      <w:pPr>
+        <w:spacing w:after="80"/>
+      </w:pPr>
+      <w:r>
+        <w:rPr>
+          <w:b/>
+          <w:bCs/>
+          <w:color w:val="B7791F"/>
+        </w:rPr>
+        <w:t xml:space="preserve">Lưu ý: </w:t>
+      </w:r>
+      <w:r>
+        <w:rPr>
+          <w:i/>
+          <w:iCs/>
+        </w:rPr>
+        <w:t xml:space="preserve">Phần hướng dẫn hiển thị ngay cho mọi người dùng (không cần AI). Ô “Hỏi AI” cần Quản trị bật AI cho trường (menu AI hỗ trợ).</w:t>
+      </w:r>
+    </w:p>
+    <w:p>
+      <w:pPr>
+        <w:spacing w:after="20" w:before="100"/>
+        <w:jc w:val="center"/>
+      </w:pPr>
+      <w:r>
+        <w:drawing>
+          <wp:inline distT="0" distB="0" distL="0" distR="0">
+            <wp:extent cx="5715000" cy="3571875"/>
+            <wp:effectExtent t="0" r="0" b="0" l="0"/>
+            <wp:docPr id="1" name="" descr="" title=""/>
+            <wp:cNvGraphicFramePr>
+              <a:graphicFrameLocks xmlns:a="http://schemas.openxmlformats.org/drawingml/2006/main" noChangeAspect="1"/>
+            </wp:cNvGraphicFramePr>
+            <a:graphic xmlns:a="http://schemas.openxmlformats.org/drawingml/2006/main">
+              <a:graphicData uri="http://schemas.openxmlformats.org/drawingml/2006/picture">
+                <pic:pic xmlns:pic="http://schemas.openxmlformats.org/drawingml/2006/picture">
+                  <pic:nvPicPr>
+                    <pic:cNvPr id="0" name="" descr=""/>
+                    <pic:cNvPicPr>
+                      <a:picLocks noChangeAspect="1" noChangeArrowheads="1"/>
+                    </pic:cNvPicPr>
+                  </pic:nvPicPr>
+                  <pic:blipFill>
+                    <a:blip r:embed="rId39" cstate="none"/>
+                    <a:srcRect/>
+                    <a:stretch>
+                      <a:fillRect/>
+                    </a:stretch>
+                  </pic:blipFill>
+                  <pic:spPr bwMode="auto">
+                    <a:xfrm>
+                      <a:off x="0" y="0"/>
+                      <a:ext cx="5715000" cy="3571875"/>
+                    </a:xfrm>
+                    <a:prstGeom prst="rect">
+                      <a:avLst/>
+                    </a:prstGeom>
+                  </pic:spPr>
+                </pic:pic>
+              </a:graphicData>
+            </a:graphic>
+          </wp:inline>
+        </w:drawing>
+      </w:r>
+    </w:p>
+    <w:p>
+      <w:pPr>
+        <w:spacing w:after="140"/>
+        <w:jc w:val="center"/>
+      </w:pPr>
+      <w:r>
+        <w:rPr>
+          <w:i/>
+          <w:iCs/>
+          <w:color w:val="555555"/>
+          <w:sz w:val="18"/>
+          <w:szCs w:val="18"/>
+        </w:rPr>
+        <w:t xml:space="preserve">▲ Bảng Trợ lý hướng dẫn: việc cần làm tại màn hình hiện tại + ô Hỏi AI.</w:t>
       </w:r>
     </w:p>
     <w:p>

</xml_diff>

<commit_message>
docs: hướng dẫn nạp dữ liệu Excel (ma trận PLO-CLO & C5–C8) vào file Word
- Bổ sung bước Import Excel ở mục CTĐT, Ma trận, Đề cương, C5–C8
- Thêm mục 5.17 "Nạp dữ liệu hàng loạt từ Excel" kèm bảng tra cứu sheet/cột
- Cập nhật danh sách chức năng chính; regenerate docs/Huong_dan_su_dung_AIQMS.docx

https://claude.ai/code/session_01Ra1ofbTJ9X2a54i9dhGJH6
</commit_message>
<xml_diff>
--- a/docs/Huong_dan_su_dung_AIQMS.docx
+++ b/docs/Huong_dan_su_dung_AIQMS.docx
@@ -252,7 +252,20 @@
         <w:spacing w:after="40"/>
       </w:pPr>
       <w:r>
-        <w:t xml:space="preserve">Xuất báo cáo: SAR ra Word/PDF, danh mục minh chứng ra Excel, gói minh chứng ZIP.</w:t>
+        <w:t xml:space="preserve">Nạp dữ liệu hàng loạt từ Excel: CTĐT/PEO/PLO, đề cương/CLO, ma trận PLO-CLO (I/R/M) và dữ liệu C5–C8.</w:t>
+      </w:r>
+    </w:p>
+    <w:p>
+      <w:pPr>
+        <w:pStyle w:val="ListParagraph"/>
+        <w:numPr>
+          <w:ilvl w:val="0"/>
+          <w:numId w:val="2"/>
+        </w:numPr>
+        <w:spacing w:after="40"/>
+      </w:pPr>
+      <w:r>
+        <w:t xml:space="preserve">Xuất báo cáo: SAR ra Word/PDF, danh mục minh chứng ra Excel, gói minh chứng ZIP, kế hoạch cải tiến ra Word/Excel.</w:t>
       </w:r>
     </w:p>
     <w:p>
@@ -2367,6 +2380,19 @@
     </w:p>
     <w:p>
       <w:pPr>
+        <w:pStyle w:val="ListParagraph"/>
+        <w:numPr>
+          <w:ilvl w:val="0"/>
+          <w:numId w:val="3"/>
+        </w:numPr>
+        <w:spacing w:after="40"/>
+      </w:pPr>
+      <w:r>
+        <w:t xml:space="preserve">Nạp nhanh bằng Excel: bấm “Import Excel” → “Tải file Excel mẫu”, điền 3 sheet ChuongTrinh, PEO, PLO rồi nạp (xem mục 5.17).</w:t>
+      </w:r>
+    </w:p>
+    <w:p>
+      <w:pPr>
         <w:spacing w:after="80"/>
       </w:pPr>
       <w:r>
@@ -2651,6 +2677,39 @@
     </w:p>
     <w:p>
       <w:pPr>
+        <w:pStyle w:val="ListParagraph"/>
+        <w:numPr>
+          <w:ilvl w:val="0"/>
+          <w:numId w:val="3"/>
+        </w:numPr>
+        <w:spacing w:after="40"/>
+      </w:pPr>
+      <w:r>
+        <w:t xml:space="preserve">Nạp nhanh bằng Excel: bấm “Nạp ma trận (Excel)” ở góc trên phải → “Tải file Excel mẫu”, điền 2 sheet MaTranPLO (Mã PLO | Mã học phần | Mức I/R/M) và CLO_PLO (Mã học phần | Mã CLO | Mã PLO) rồi chọn file để nạp. Mức chấp nhận cả nhãn tiếng Việt: Giới thiệu/Củng cố/Thành thạo.</w:t>
+      </w:r>
+    </w:p>
+    <w:p>
+      <w:pPr>
+        <w:spacing w:after="80"/>
+      </w:pPr>
+      <w:r>
+        <w:rPr>
+          <w:b/>
+          <w:bCs/>
+          <w:color w:val="B7791F"/>
+        </w:rPr>
+        <w:t xml:space="preserve">Lưu ý: </w:t>
+      </w:r>
+      <w:r>
+        <w:rPr>
+          <w:i/>
+          <w:iCs/>
+        </w:rPr>
+        <w:t xml:space="preserve">PLO/học phần/CLO phải đã tồn tại (qua nhập tay hoặc import CTĐT/đề cương) trước khi nạp ma trận.</w:t>
+      </w:r>
+    </w:p>
+    <w:p>
+      <w:pPr>
         <w:spacing w:after="20" w:before="100"/>
         <w:jc w:val="center"/>
       </w:pPr>
@@ -2765,6 +2824,19 @@
     </w:p>
     <w:p>
       <w:pPr>
+        <w:pStyle w:val="ListParagraph"/>
+        <w:numPr>
+          <w:ilvl w:val="0"/>
+          <w:numId w:val="3"/>
+        </w:numPr>
+        <w:spacing w:after="40"/>
+      </w:pPr>
+      <w:r>
+        <w:t xml:space="preserve">Nạp nhanh bằng Excel: bấm “Import Excel” → “Tải file Excel mẫu”, điền sheet HocPhan (mã, tên, tín chỉ, đề cương…) và CLO (Mã học phần | Mã | Mô tả) rồi nạp. Nạp lại idempotent — trùng mã sẽ cập nhật, không nhân bản.</w:t>
+      </w:r>
+    </w:p>
+    <w:p>
+      <w:pPr>
         <w:spacing w:after="20" w:before="100"/>
         <w:jc w:val="center"/>
       </w:pPr>
@@ -3945,6 +4017,52 @@
     </w:p>
     <w:p>
       <w:pPr>
+        <w:pStyle w:val="ListParagraph"/>
+        <w:numPr>
+          <w:ilvl w:val="0"/>
+          <w:numId w:val="3"/>
+        </w:numPr>
+        <w:spacing w:after="40"/>
+      </w:pPr>
+      <w:r>
+        <w:t xml:space="preserve">Nạp nhanh bằng Excel: ở bất kỳ trang nào trong nhóm này, bấm “Nạp Excel C5–C8” → “Tải file Excel mẫu”. File mẫu có 4 sheet: C5_GiangVien, C6_NguoiHoc, C7_CoSoVatChat, C8_KetQua.</w:t>
+      </w:r>
+    </w:p>
+    <w:p>
+      <w:pPr>
+        <w:pStyle w:val="ListParagraph"/>
+        <w:numPr>
+          <w:ilvl w:val="0"/>
+          <w:numId w:val="3"/>
+        </w:numPr>
+        <w:spacing w:after="40"/>
+      </w:pPr>
+      <w:r>
+        <w:t xml:space="preserve">Điền dữ liệu vào các sheet cần dùng rồi nạp một lần — hệ thống đọc tất cả sheet có trong file. Các trường phân loại (hình thức GV, nhóm dịch vụ, loại CSVC, nhóm chỉ số) ghi bằng tiếng Việt, phần mềm tự quy đổi (vd “Phòng máy”→lab, “Toàn thời gian”→full_time).</w:t>
+      </w:r>
+    </w:p>
+    <w:p>
+      <w:pPr>
+        <w:spacing w:after="80"/>
+      </w:pPr>
+      <w:r>
+        <w:rPr>
+          <w:b/>
+          <w:bCs/>
+          <w:color w:val="B7791F"/>
+        </w:rPr>
+        <w:t xml:space="preserve">Lưu ý: </w:t>
+      </w:r>
+      <w:r>
+        <w:rPr>
+          <w:i/>
+          <w:iCs/>
+        </w:rPr>
+        <w:t xml:space="preserve">Bản ghi trùng (theo họ tên GV / nội dung dịch vụ / tên CSVC / tên chỉ số + năm học) sẽ được bỏ qua để tránh nhân bản khi nạp lại.</w:t>
+      </w:r>
+    </w:p>
+    <w:p>
+      <w:pPr>
         <w:spacing w:after="20" w:before="100"/>
         <w:jc w:val="center"/>
       </w:pPr>
@@ -4002,7 +4120,7 @@
           <w:sz w:val="18"/>
           <w:szCs w:val="18"/>
         </w:rPr>
-        <w:t xml:space="preserve">▲ Đội ngũ giảng viên (tiêu chí C5).</w:t>
+        <w:t xml:space="preserve">▲ Đội ngũ giảng viên (tiêu chí C5) — bấm “Nạp Excel C5–C8” để nạp hàng loạt.</w:t>
       </w:r>
     </w:p>
     <w:p>
@@ -5270,6 +5388,361 @@
           <w:szCs w:val="18"/>
         </w:rPr>
         <w:t xml:space="preserve">▲ Bảng Trợ lý hướng dẫn: việc cần làm tại màn hình hiện tại + ô Hỏi AI.</w:t>
+      </w:r>
+    </w:p>
+    <w:p>
+      <w:pPr>
+        <w:pStyle w:val="Heading2"/>
+        <w:spacing w:after="80" w:before="200"/>
+      </w:pPr>
+      <w:r>
+        <w:rPr>
+          <w:b/>
+          <w:bCs/>
+        </w:rPr>
+        <w:t xml:space="preserve">5.17. Nạp dữ liệu hàng loạt từ Excel</w:t>
+      </w:r>
+    </w:p>
+    <w:p>
+      <w:pPr>
+        <w:spacing w:after="80"/>
+      </w:pPr>
+      <w:r>
+        <w:t xml:space="preserve">Khi cần nạp nhiều dữ liệu cùng lúc (ví dụ chuẩn bị một đợt kiểm định), dùng các nút Import Excel trên từng màn hình. Quy trình chung gồm 3 bước: (1) bấm nút Import/“Nạp …”; (2) bấm “Tải file Excel mẫu” và điền theo đúng tên sheet/cột; (3) chọn file .xlsx và bấm “Nạp dữ liệu”. Kết quả hiển thị số bản ghi tạo mới/cập nhật và danh sách lỗi theo từng dòng (nếu có).</w:t>
+      </w:r>
+    </w:p>
+    <w:p>
+      <w:pPr>
+        <w:spacing w:after="80"/>
+      </w:pPr>
+      <w:r>
+        <w:t xml:space="preserve">Bảng dưới đây tổng hợp các loại dữ liệu nạp được và tên sheet/cột tương ứng trong file mẫu:</w:t>
+      </w:r>
+    </w:p>
+    <w:tbl>
+      <w:tblPr>
+        <w:tblW w:type="pct" w:w="100%"/>
+        <w:tblBorders>
+          <w:top w:val="single" w:color="AAAAAA" w:sz="4"/>
+          <w:left w:val="single" w:color="AAAAAA" w:sz="4"/>
+          <w:bottom w:val="single" w:color="AAAAAA" w:sz="4"/>
+          <w:right w:val="single" w:color="AAAAAA" w:sz="4"/>
+          <w:insideH w:val="single" w:color="CCCCCC" w:sz="2"/>
+          <w:insideV w:val="single" w:color="CCCCCC" w:sz="2"/>
+        </w:tblBorders>
+      </w:tblPr>
+      <w:tblGrid>
+        <w:gridCol w:w="100"/>
+        <w:gridCol w:w="100"/>
+        <w:gridCol w:w="100"/>
+      </w:tblGrid>
+      <w:tr>
+        <w:trPr>
+          <w:tblHeader/>
+        </w:trPr>
+        <w:tc>
+          <w:tcPr>
+            <w:tcW w:type="pct" w:w="28%"/>
+            <w:shd w:fill="DCE6F1"/>
+            <w:tcMar>
+              <w:top w:type="dxa" w:w="60"/>
+              <w:left w:type="dxa" w:w="100"/>
+              <w:bottom w:type="dxa" w:w="60"/>
+              <w:right w:type="dxa" w:w="100"/>
+            </w:tcMar>
+          </w:tcPr>
+          <w:p>
+            <w:r>
+              <w:rPr>
+                <w:b/>
+                <w:bCs/>
+              </w:rPr>
+              <w:t xml:space="preserve">Màn hình (nút)</w:t>
+            </w:r>
+          </w:p>
+        </w:tc>
+        <w:tc>
+          <w:tcPr>
+            <w:tcW w:type="pct" w:w="26%"/>
+            <w:shd w:fill="DCE6F1"/>
+            <w:tcMar>
+              <w:top w:type="dxa" w:w="60"/>
+              <w:left w:type="dxa" w:w="100"/>
+              <w:bottom w:type="dxa" w:w="60"/>
+              <w:right w:type="dxa" w:w="100"/>
+            </w:tcMar>
+          </w:tcPr>
+          <w:p>
+            <w:r>
+              <w:rPr>
+                <w:b/>
+                <w:bCs/>
+              </w:rPr>
+              <w:t xml:space="preserve">Sheet trong Excel</w:t>
+            </w:r>
+          </w:p>
+        </w:tc>
+        <w:tc>
+          <w:tcPr>
+            <w:tcW w:type="pct" w:w="46%"/>
+            <w:shd w:fill="DCE6F1"/>
+            <w:tcMar>
+              <w:top w:type="dxa" w:w="60"/>
+              <w:left w:type="dxa" w:w="100"/>
+              <w:bottom w:type="dxa" w:w="60"/>
+              <w:right w:type="dxa" w:w="100"/>
+            </w:tcMar>
+          </w:tcPr>
+          <w:p>
+            <w:r>
+              <w:rPr>
+                <w:b/>
+                <w:bCs/>
+              </w:rPr>
+              <w:t xml:space="preserve">Các cột chính</w:t>
+            </w:r>
+          </w:p>
+        </w:tc>
+      </w:tr>
+      <w:tr>
+        <w:tc>
+          <w:tcPr>
+            <w:tcW w:type="pct" w:w="28%"/>
+            <w:tcMar>
+              <w:top w:type="dxa" w:w="60"/>
+              <w:left w:type="dxa" w:w="100"/>
+              <w:bottom w:type="dxa" w:w="60"/>
+              <w:right w:type="dxa" w:w="100"/>
+            </w:tcMar>
+          </w:tcPr>
+          <w:p>
+            <w:r>
+              <w:t xml:space="preserve">Chương trình đào tạo (Import Excel)</w:t>
+            </w:r>
+          </w:p>
+        </w:tc>
+        <w:tc>
+          <w:tcPr>
+            <w:tcW w:type="pct" w:w="26%"/>
+            <w:tcMar>
+              <w:top w:type="dxa" w:w="60"/>
+              <w:left w:type="dxa" w:w="100"/>
+              <w:bottom w:type="dxa" w:w="60"/>
+              <w:right w:type="dxa" w:w="100"/>
+            </w:tcMar>
+          </w:tcPr>
+          <w:p>
+            <w:r>
+              <w:t xml:space="preserve">ChuongTrinh / PEO / PLO</w:t>
+            </w:r>
+          </w:p>
+        </w:tc>
+        <w:tc>
+          <w:tcPr>
+            <w:tcW w:type="pct" w:w="46%"/>
+            <w:tcMar>
+              <w:top w:type="dxa" w:w="60"/>
+              <w:left w:type="dxa" w:w="100"/>
+              <w:bottom w:type="dxa" w:w="60"/>
+              <w:right w:type="dxa" w:w="100"/>
+            </w:tcMar>
+          </w:tcPr>
+          <w:p>
+            <w:r>
+              <w:t xml:space="preserve">Mã CTĐT, Tên, Trình độ, Tổng tín chỉ, Phiên bản · (PEO/PLO) Mã CTĐT, Phiên bản, Mã, Mô tả</w:t>
+            </w:r>
+          </w:p>
+        </w:tc>
+      </w:tr>
+      <w:tr>
+        <w:tc>
+          <w:tcPr>
+            <w:tcW w:type="pct" w:w="28%"/>
+            <w:tcMar>
+              <w:top w:type="dxa" w:w="60"/>
+              <w:left w:type="dxa" w:w="100"/>
+              <w:bottom w:type="dxa" w:w="60"/>
+              <w:right w:type="dxa" w:w="100"/>
+            </w:tcMar>
+          </w:tcPr>
+          <w:p>
+            <w:r>
+              <w:t xml:space="preserve">Đề cương học phần (Import Excel)</w:t>
+            </w:r>
+          </w:p>
+        </w:tc>
+        <w:tc>
+          <w:tcPr>
+            <w:tcW w:type="pct" w:w="26%"/>
+            <w:tcMar>
+              <w:top w:type="dxa" w:w="60"/>
+              <w:left w:type="dxa" w:w="100"/>
+              <w:bottom w:type="dxa" w:w="60"/>
+              <w:right w:type="dxa" w:w="100"/>
+            </w:tcMar>
+          </w:tcPr>
+          <w:p>
+            <w:r>
+              <w:t xml:space="preserve">HocPhan / CLO</w:t>
+            </w:r>
+          </w:p>
+        </w:tc>
+        <w:tc>
+          <w:tcPr>
+            <w:tcW w:type="pct" w:w="46%"/>
+            <w:tcMar>
+              <w:top w:type="dxa" w:w="60"/>
+              <w:left w:type="dxa" w:w="100"/>
+              <w:bottom w:type="dxa" w:w="60"/>
+              <w:right w:type="dxa" w:w="100"/>
+            </w:tcMar>
+          </w:tcPr>
+          <w:p>
+            <w:r>
+              <w:t xml:space="preserve">Mã học phần, Tên, Số tín chỉ, Mô tả, Tiên quyết, Nội dung, PP giảng dạy, PP đánh giá, Tài liệu, Rubric · (CLO) Mã học phần, Mã, Mô tả</w:t>
+            </w:r>
+          </w:p>
+        </w:tc>
+      </w:tr>
+      <w:tr>
+        <w:tc>
+          <w:tcPr>
+            <w:tcW w:type="pct" w:w="28%"/>
+            <w:tcMar>
+              <w:top w:type="dxa" w:w="60"/>
+              <w:left w:type="dxa" w:w="100"/>
+              <w:bottom w:type="dxa" w:w="60"/>
+              <w:right w:type="dxa" w:w="100"/>
+            </w:tcMar>
+          </w:tcPr>
+          <w:p>
+            <w:r>
+              <w:t xml:space="preserve">Ma trận PLO-CLO (Nạp ma trận)</w:t>
+            </w:r>
+          </w:p>
+        </w:tc>
+        <w:tc>
+          <w:tcPr>
+            <w:tcW w:type="pct" w:w="26%"/>
+            <w:tcMar>
+              <w:top w:type="dxa" w:w="60"/>
+              <w:left w:type="dxa" w:w="100"/>
+              <w:bottom w:type="dxa" w:w="60"/>
+              <w:right w:type="dxa" w:w="100"/>
+            </w:tcMar>
+          </w:tcPr>
+          <w:p>
+            <w:r>
+              <w:t xml:space="preserve">MaTranPLO / CLO_PLO</w:t>
+            </w:r>
+          </w:p>
+        </w:tc>
+        <w:tc>
+          <w:tcPr>
+            <w:tcW w:type="pct" w:w="46%"/>
+            <w:tcMar>
+              <w:top w:type="dxa" w:w="60"/>
+              <w:left w:type="dxa" w:w="100"/>
+              <w:bottom w:type="dxa" w:w="60"/>
+              <w:right w:type="dxa" w:w="100"/>
+            </w:tcMar>
+          </w:tcPr>
+          <w:p>
+            <w:r>
+              <w:t xml:space="preserve">(PLO×HP) Mã PLO, Mã học phần, Mức (I/R/M) · (CLO-PLO) Mã học phần, Mã CLO, Mã PLO</w:t>
+            </w:r>
+          </w:p>
+        </w:tc>
+      </w:tr>
+      <w:tr>
+        <w:tc>
+          <w:tcPr>
+            <w:tcW w:type="pct" w:w="28%"/>
+            <w:tcMar>
+              <w:top w:type="dxa" w:w="60"/>
+              <w:left w:type="dxa" w:w="100"/>
+              <w:bottom w:type="dxa" w:w="60"/>
+              <w:right w:type="dxa" w:w="100"/>
+            </w:tcMar>
+          </w:tcPr>
+          <w:p>
+            <w:r>
+              <w:t xml:space="preserve">Đội ngũ GV / Người học / CSVC / Kết quả (Nạp Excel C5–C8)</w:t>
+            </w:r>
+          </w:p>
+        </w:tc>
+        <w:tc>
+          <w:tcPr>
+            <w:tcW w:type="pct" w:w="26%"/>
+            <w:tcMar>
+              <w:top w:type="dxa" w:w="60"/>
+              <w:left w:type="dxa" w:w="100"/>
+              <w:bottom w:type="dxa" w:w="60"/>
+              <w:right w:type="dxa" w:w="100"/>
+            </w:tcMar>
+          </w:tcPr>
+          <w:p>
+            <w:r>
+              <w:t xml:space="preserve">C5_GiangVien / C6_NguoiHoc / C7_CoSoVatChat / C8_KetQua</w:t>
+            </w:r>
+          </w:p>
+        </w:tc>
+        <w:tc>
+          <w:tcPr>
+            <w:tcW w:type="pct" w:w="46%"/>
+            <w:tcMar>
+              <w:top w:type="dxa" w:w="60"/>
+              <w:left w:type="dxa" w:w="100"/>
+              <w:bottom w:type="dxa" w:w="60"/>
+              <w:right w:type="dxa" w:w="100"/>
+            </w:tcMar>
+          </w:tcPr>
+          <w:p>
+            <w:r>
+              <w:t xml:space="preserve">C5: Họ tên, Học hàm, Học vị, FTE, Hình thức, Giới tính… · C6: Nhóm, Nội dung, Đối tượng, Số người hưởng lợi · C7: Tên, Loại, Diện tích, Tình trạng… · C8: Tên chỉ số, Nhóm, Giá trị, Mục tiêu, Đối sánh…</w:t>
+            </w:r>
+          </w:p>
+        </w:tc>
+      </w:tr>
+    </w:tbl>
+    <w:p>
+      <w:pPr>
+        <w:spacing w:after="80"/>
+      </w:pPr>
+      <w:r>
+        <w:rPr>
+          <w:b/>
+          <w:bCs/>
+          <w:color w:val="B7791F"/>
+        </w:rPr>
+        <w:t xml:space="preserve">Lưu ý: </w:t>
+      </w:r>
+      <w:r>
+        <w:rPr>
+          <w:i/>
+          <w:iCs/>
+        </w:rPr>
+        <w:t xml:space="preserve">Tên cột dò linh hoạt (không phân biệt hoa/thường, khớp cả khi tiêu đề có chú thích như “Mức (I/R/M)”). Các trường phân loại ghi bằng tiếng Việt sẽ được tự quy đổi sang mã chuẩn. Người dùng &amp; vai trò (RBAC) tạo ở màn hình Người dùng (không qua import).</w:t>
+      </w:r>
+    </w:p>
+    <w:p>
+      <w:pPr>
+        <w:spacing w:after="80"/>
+      </w:pPr>
+      <w:r>
+        <w:rPr>
+          <w:b/>
+          <w:bCs/>
+          <w:color w:val="B7791F"/>
+        </w:rPr>
+        <w:t xml:space="preserve">Lưu ý: </w:t>
+      </w:r>
+      <w:r>
+        <w:rPr>
+          <w:i/>
+          <w:iCs/>
+        </w:rPr>
+        <w:t xml:space="preserve">Minh chứng được nạp bằng cách upload file trực tiếp ở màn hình Minh chứng (hệ thống tự đánh mã MC-XXXX), không qua Excel.</w:t>
       </w:r>
     </w:p>
     <w:p>

</xml_diff>